<commit_message>
Adjust boleto clause formatting
</commit_message>
<xml_diff>
--- a/src/templates/boleto-template-cuotas.docx
+++ b/src/templates/boleto-template-cuotas.docx
@@ -647,7 +647,18 @@
           <w:u w:val="single"/>
           <w:lang w:val="es-ES_tradnl"/>
         </w:rPr>
-        <w:t>PRIMERA: La parte VENDEDORA VENDE a la PARTE COMPRADORA, el siguiente inmueble de su propiedad: una FINCA ubicada en la Sección IV, en la LOCALIDAD Y PARTIDO DE MORENO, PROVINCIA DE BUENOS AIRES, con frente a la calle {calleInmueble}, entre las de {limites} edificada en el lote designado según {tituloPlano}, como LOTE {lote} DE LA MANZANA {manzana}, el cual consta de las siguientes medidas, linderos y superficies: {medidas}.- NOMENCLATURA CATASTRAL: Circunscripción V, Sección F, Manzana {manzana}, Parcela {parcelaCatastral}.- PARTIDA INMOBILIARIA: 074-{partida}.- Inscripto su dominio en el Registro de la Propiedad Inmueble en la Matrícula {matricula}</w:t>
+        <w:t>PRIMERA</w:t>
+      </w:r>
+      <w:r>
+        <w:rPr>
+          <w:rFonts w:ascii="Times New Roman" w:hAnsi="Times New Roman" w:cs="Times New Roman"/>
+          <w:color w:val="000000"/>
+          <w:sz w:val="24"/>
+          <w:szCs w:val="24"/>
+          <w:u w:val="single"/>
+          <w:lang w:val="es-ES_tradnl"/>
+        </w:rPr>
+        <w:t xml:space="preserve">: La parte VENDEDORA VENDE a la PARTE COMPRADORA, el siguiente inmueble de su propiedad: una FINCA ubicada en la Sección IV, en la LOCALIDAD Y PARTIDO DE MORENO, PROVINCIA DE BUENOS AIRES, con frente a la calle {calleInmueble}, entre las de {limites} edificada en el lote designado según {tituloPlano}, como LOTE {lote} DE LA MANZANA {manzana}, el cual consta de las siguientes medidas, linderos y superficies: {medidas}.- NOMENCLATURA CATASTRAL: Circunscripción V, Sección F, Manzana {manzana}, Parcela {parcelaCatastral}.- PARTIDA INMOBILIARIA: 074-{partida}.- Inscripto su dominio en el Registro de la Propiedad Inmueble en la Matrícula {matricula}</w:t>
       </w:r>
       <w:r>
         <w:rPr>
@@ -1506,7 +1517,18 @@
           <w:u w:val="single"/>
           <w:lang w:val="es-ES_tradnl"/>
         </w:rPr>
-        <w:t>SEGUNDA: La PARTE VENDEDORA declara bajo juramento que el inmueble le corresponde por compra que realizara a CERAMICA JUAN STEFANI S.A.C.I.F.I. y A., según escritura {escritura} de fecha {fechaEscritura}, pasada ante el Escribano de ésta Ciudad, Sebastián E. Nadela, al folio {folio} del Registro 1.453 a su cargo, cuya Primera Copia se inscribió en el Registro de la Propiedad Inmueble de la Provincia de Buenos Aires, con fecha {fechaEscritura}, en la Matrícula {matriculaSegunda}</w:t>
+        <w:t>SEGUNDA</w:t>
+      </w:r>
+      <w:r>
+        <w:rPr>
+          <w:rFonts w:ascii="Times New Roman" w:hAnsi="Times New Roman" w:cs="Times New Roman"/>
+          <w:color w:val="000000"/>
+          <w:sz w:val="24"/>
+          <w:szCs w:val="24"/>
+          <w:u w:val="single"/>
+          <w:lang w:val="es-ES_tradnl"/>
+        </w:rPr>
+        <w:t xml:space="preserve">: La PARTE VENDEDORA declara bajo juramento que el inmueble le corresponde por compra que realizara a CERAMICA JUAN STEFANI S.A.C.I.F.I. y A., según escritura {escritura} de fecha {fechaEscritura}, pasada ante el Escribano de ésta Ciudad, Sebastián E. Nadela, al folio {folio} del Registro 1.453 a su cargo, cuya Primera Copia se inscribió en el Registro de la Propiedad Inmueble de la Provincia de Buenos Aires, con fecha {fechaEscritura}, en la Matrícula {matriculaSegunda}</w:t>
       </w:r>
       <w:r>
         <w:rPr>
@@ -2001,7 +2023,18 @@
           <w:u w:val="single"/>
           <w:lang w:val="es-ES_tradnl"/>
         </w:rPr>
-        <w:t xml:space="preserve">TERCERA: Esta venta se realiza por el precio total y convenido de DÓLARES ESTADOUNIDENSES BILLETE {precioTotalPalabras}, (U$S {precioTotalNum}, que la PARTE COMPRADORA abonará a la PARTE VENDEDORA de la siguiente manera: la suma de DÓLARES ESTADOUNIDENSES BILLETE {anticipoPalabras}, (U$S {anticipoNum},) la PARTE COMPRADORA entrega la PARTE VENDEDORA en este acto, en billetes de dicha moneda, a cuenta de precio y como principio de ejecución del contrato, sirviendo el presente de suficiente recibo y carta de pago en forma; y el saldo, es decir, la suma de DÓLARES ESTADOUNIDENSES BILLETE {saldoPalabras}, (U$S {saldoNum},) serán abonados por la PARTE COMPRADORA a la PARTE VENDEDORA EN {cantidadCuotas} CUOTAS, mensuales, iguales y consecutivas de DÓLARES ESTADOUNIDENSES BILLETE {cuotaMensualPalabras}, (U$S {cuotaMensual}),  en billetes de dicha moneda, contra el pago y saldo total de la deuda y se celebrara la oportunidad de suscribirse la escritura traslativa de dominio, en el lugar a designar por la PARTE COMPRADORA dentro del radio de la Ciudad Autónoma de Buenos Aires.- Ambas partes manifiestan que otorgan plena validez al pago que se efectúan mediante el presente y expresan que no tienen reclamo que formularse y renuncian a invocar las acciones establecidas en los artículos 1083 a 1088 del Código Civil y Comercial de la Nación respecto al pacto comisorio, como así también renuncian a cualquier acción que les pudiera corresponder por incumplimiento de la ley 25.345. Las partes renuncian a la facultad de arrepentimiento prevista por el artículo 1059 del mencionado Código.- </w:t>
+        <w:t xml:space="preserve">TERCERA</w:t>
+      </w:r>
+      <w:r>
+        <w:rPr>
+          <w:rFonts w:ascii="Times New Roman" w:hAnsi="Times New Roman" w:cs="Times New Roman"/>
+          <w:color w:val="000000"/>
+          <w:sz w:val="24"/>
+          <w:szCs w:val="24"/>
+          <w:u w:val="single"/>
+          <w:lang w:val="es-ES_tradnl"/>
+        </w:rPr>
+        <w:t xml:space="preserve">: Esta venta se realiza por el precio total y convenido de DÓLARES ESTADOUNIDENSES BILLETE {precioTotalPalabras}, (U$S {precioTotalNum}, que la PARTE COMPRADORA abonará a la PARTE VENDEDORA de la siguiente manera: la suma de DÓLARES ESTADOUNIDENSES BILLETE {anticipoPalabras}, (U$S {anticipoNum},) la PARTE COMPRADORA entrega la PARTE VENDEDORA en este acto, en billetes de dicha moneda, a cuenta de precio y como principio de ejecución del contrato, sirviendo el presente de suficiente recibo y carta de pago en forma; y el saldo, es decir, la suma de DÓLARES ESTADOUNIDENSES BILLETE {saldoPalabras}, (U$S {saldoNum},) serán abonados por la PARTE COMPRADORA a la PARTE VENDEDORA EN {cantidadCuotas} CUOTAS, mensuales, iguales y consecutivas de DÓLARES ESTADOUNIDENSES BILLETE {cuotaMensualPalabras}, (U$S {cuotaMensual}),  en billetes de dicha moneda, contra el pago y saldo total de la deuda y se celebrara la oportunidad de suscribirse la escritura traslativa de dominio, en el lugar a designar por la PARTE COMPRADORA dentro del radio de la Ciudad Autónoma de Buenos Aires.- Ambas partes manifiestan que otorgan plena validez al pago que se efectúan mediante el presente y expresan que no tienen reclamo que formularse y renuncian a invocar las acciones establecidas en los artículos 1083 a 1088 del Código Civil y Comercial de la Nación respecto al pacto comisorio, como así también renuncian a cualquier acción que les pudiera corresponder por incumplimiento de la ley 25.345. Las partes renuncian a la facultad de arrepentimiento prevista por el artículo 1059 del mencionado Código.- </w:t>
       </w:r>
       <w:r>
         <w:rPr>

</xml_diff>

<commit_message>
Adjust boleto possession clause
</commit_message>
<xml_diff>
--- a/src/templates/boleto-template-cuotas.docx
+++ b/src/templates/boleto-template-cuotas.docx
@@ -524,89 +524,7 @@
           <w:szCs w:val="24"/>
           <w:lang w:val="es-ES_tradnl"/>
         </w:rPr>
-        <w:t xml:space="preserve">.- La posesión será entregada por </w:t>
-      </w:r>
-      <w:r>
-        <w:rPr>
-          <w:rFonts w:ascii="Times New Roman" w:hAnsi="Times New Roman" w:cs="Times New Roman"/>
-          <w:color w:val="000000"/>
-          <w:sz w:val="24"/>
-          <w:szCs w:val="24"/>
-          <w:lang w:val="es-ES_tradnl"/>
-        </w:rPr>
-        <w:t xml:space="preserve">la </w:t>
-      </w:r>
-      <w:r>
-        <w:rPr>
-          <w:rFonts w:ascii="Times New Roman" w:hAnsi="Times New Roman" w:cs="Times New Roman"/>
-          <w:b/>
-          <w:bCs/>
-          <w:color w:val="000000"/>
-          <w:sz w:val="24"/>
-          <w:szCs w:val="24"/>
-          <w:lang w:val="es-ES_tradnl"/>
-        </w:rPr>
-        <w:t>PARTE VENDEDORA</w:t>
-      </w:r>
-      <w:r>
-        <w:rPr>
-          <w:rFonts w:ascii="Times New Roman" w:hAnsi="Times New Roman" w:cs="Times New Roman"/>
-          <w:color w:val="000000"/>
-          <w:sz w:val="24"/>
-          <w:szCs w:val="24"/>
-          <w:lang w:val="es-ES_tradnl"/>
-        </w:rPr>
-        <w:t xml:space="preserve"> </w:t>
-      </w:r>
-      <w:r>
-        <w:rPr>
-          <w:rFonts w:ascii="Times New Roman" w:hAnsi="Times New Roman" w:cs="Times New Roman"/>
-          <w:color w:val="000000"/>
-          <w:sz w:val="24"/>
-          <w:szCs w:val="24"/>
-          <w:lang w:val="es-ES_tradnl"/>
-        </w:rPr>
-        <w:t xml:space="preserve">a </w:t>
-      </w:r>
-      <w:r>
-        <w:rPr>
-          <w:rFonts w:ascii="Times New Roman" w:hAnsi="Times New Roman" w:cs="Times New Roman"/>
-          <w:sz w:val="24"/>
-          <w:szCs w:val="24"/>
-          <w:lang w:val="es-ES_tradnl"/>
-        </w:rPr>
-        <w:t xml:space="preserve">la </w:t>
-      </w:r>
-      <w:r>
-        <w:rPr>
-          <w:rFonts w:ascii="Times New Roman" w:hAnsi="Times New Roman" w:cs="Times New Roman"/>
-          <w:b/>
-          <w:bCs/>
-          <w:sz w:val="24"/>
-          <w:szCs w:val="24"/>
-          <w:lang w:val="es-ES_tradnl"/>
-        </w:rPr>
-        <w:t>PARTE COMPRADORA</w:t>
-      </w:r>
-      <w:r>
-        <w:rPr>
-          <w:rFonts w:ascii="Times New Roman" w:hAnsi="Times New Roman" w:cs="Times New Roman"/>
-          <w:color w:val="000000"/>
-          <w:sz w:val="24"/>
-          <w:szCs w:val="24"/>
-          <w:lang w:val="es-ES_tradnl"/>
-        </w:rPr>
-        <w:t xml:space="preserve"> </w:t>
-      </w:r>
-      <w:r>
-        <w:rPr>
-          <w:rFonts w:ascii="Times New Roman" w:hAnsi="Times New Roman" w:cs="Times New Roman"/>
-          <w:color w:val="000000"/>
-          <w:sz w:val="24"/>
-          <w:szCs w:val="24"/>
-          <w:lang w:val="es-ES_tradnl"/>
-        </w:rPr>
-        <w:t xml:space="preserve">en oportunidad de suscribirse la escritura traslativa de dominio, libre de efectos y/u ocupantes y sin oposición de terceros; recibiéndola ésta última de conformidad.- </w:t>
+        <w:t xml:space="preserve">.- {#entregaCuota}La posesión será entregada por la PARTE VENDEDORA a la PARTE COMPRADORA contra el pago de la cuota N° {numeroCuotaEntrega}, libre de efectos y/u ocupantes y sin oposición de terceros; recibiéndola ésta última de conformidad.-{/entregaCuota}{#entregaAlSaldo}La posesión será entregada por la PARTE VENDEDORA a la PARTE COMPRADORA en oportunidad de suscribirse la escritura traslativa de dominio, libre de efectos y/u ocupantes y sin oposición de terceros; recibiéndola ésta última de conformidad.-{/entregaAlSaldo} </w:t>
       </w:r>
     </w:p>
     <w:p>

</xml_diff>

<commit_message>
Require leads for new reservations
</commit_message>
<xml_diff>
--- a/src/templates/boleto-template-cuotas.docx
+++ b/src/templates/boleto-template-cuotas.docx
@@ -149,29 +149,7 @@
           <w:lang w:val="es-ES_tradnl"/>
         </w:rPr>
         <w:lastRenderedPageBreak/>
-        <w:t xml:space="preserve">y A., según escritura {escritura} de fecha {fechaEscritura}, pasada ante el Escribano de </w:t>
-      </w:r>
-      <w:proofErr w:type="gramStart"/>
-      <w:r>
-        <w:rPr>
-          <w:rFonts w:ascii="Times New Roman" w:hAnsi="Times New Roman" w:cs="Times New Roman"/>
-          <w:color w:val="000000"/>
-          <w:sz w:val="24"/>
-          <w:szCs w:val="24"/>
-          <w:lang w:val="es-ES_tradnl"/>
-        </w:rPr>
-        <w:t>ésta</w:t>
-      </w:r>
-      <w:proofErr w:type="gramEnd"/>
-      <w:r>
-        <w:rPr>
-          <w:rFonts w:ascii="Times New Roman" w:hAnsi="Times New Roman" w:cs="Times New Roman"/>
-          <w:color w:val="000000"/>
-          <w:sz w:val="24"/>
-          <w:szCs w:val="24"/>
-          <w:lang w:val="es-ES_tradnl"/>
-        </w:rPr>
-        <w:t xml:space="preserve"> Ciudad, Sebastián E. Nadela, al folio {folio} del Registro 1.453 a su cargo, cuya Primera Copia se inscribió en el Registro de la Propiedad Inmueble de la Provincia de Buenos Aires, con fecha {fechaEscritura}, en la Matrícula {matriculaSegunda}</w:t>
+        <w:t>y A., según escritura {escritura} de fecha {fechaEscritura}, pasada ante el Escribano de ésta Ciudad, Sebastián E. Nadela, al folio {folio} del Registro 1.453 a su cargo, cuya Primera Copia se inscribió en el Registro de la Propiedad Inmueble de la Provincia de Buenos Aires, con fecha {fechaEscritura}, en la Matrícula {matriculaSegunda}</w:t>
       </w:r>
       <w:r>
         <w:rPr>
@@ -220,20 +198,68 @@
           <w:szCs w:val="24"/>
           <w:lang w:val="es-ES_tradnl"/>
         </w:rPr>
-        <w:t xml:space="preserve">: Esta venta se realiza por el precio total y convenido de DÓLARES ESTADOUNIDENSES BILLETE {precioTotalPalabras}, (U$S {precioTotalNum}, que la PARTE COMPRADORA abonará a la PARTE VENDEDORA de la siguiente manera: la suma de DÓLARES ESTADOUNIDENSES BILLETE {anticipoPalabras}, (U$S {anticipoNum},) la PARTE COMPRADORA entrega la PARTE VENDEDORA en este acto, en billetes de dicha moneda, a cuenta de precio y como principio de ejecución del contrato, sirviendo el presente de suficiente recibo y carta de pago en forma; y el saldo, es decir, la suma de DÓLARES ESTADOUNIDENSES BILLETE {saldoPalabras}, (U$S {saldoNum},) serán abonados por la PARTE COMPRADORA a la PARTE VENDEDORA EN {cantidadCuotas} CUOTAS, mensuales, iguales y consecutivas de DÓLARES ESTADOUNIDENSES BILLETE {cuotaMensualPalabras}, (U$S {cuotaMensual}),  en billetes de dicha moneda, contra el pago y saldo total de la deuda y se celebrara la oportunidad de suscribirse la escritura traslativa de dominio, en el lugar a designar por la PARTE COMPRADORA dentro del radio de la Ciudad Autónoma de Buenos Aires.- Ambas partes manifiestan que otorgan plena validez al pago que se efectúan mediante el presente y expresan que no tienen reclamo que formularse y renuncian a invocar las acciones establecidas en los artículos 1083 a 1088 del Código Civil y Comercial de la Nación respecto al pacto comisorio, como así también renuncian a cualquier acción que les pudiera corresponder por incumplimiento de la ley 25.345. Las partes renuncian a la facultad de arrepentimiento prevista por el artículo 1059 del mencionado </w:t>
-      </w:r>
-      <w:proofErr w:type="gramStart"/>
-      <w:r>
-        <w:rPr>
-          <w:rFonts w:ascii="Times New Roman" w:hAnsi="Times New Roman" w:cs="Times New Roman"/>
-          <w:color w:val="000000"/>
-          <w:sz w:val="24"/>
-          <w:szCs w:val="24"/>
-          <w:lang w:val="es-ES_tradnl"/>
-        </w:rPr>
-        <w:t>Código.-</w:t>
-      </w:r>
-      <w:proofErr w:type="gramEnd"/>
+        <w:t>: Esta venta se realiza por el precio total y convenido de DÓLARES ESTADOUNIDENSES BILLETE {precioTotalPalabras}, (U$S {precioTotalNum}, que la PARTE COMPRADORA abonará a la PARTE VENDEDORA de la siguiente manera: la suma de DÓLARES ESTADOUNIDENSES BILLETE {anticipoPalabras}, (U$S {anticipoNum},) la PARTE COMPRADORA entrega la PARTE VENDEDORA en este acto, en billetes de dicha moneda, a cuenta de precio y como principio de ejecución del contrato, sirviendo el presente de suficiente recibo y carta de pago en forma; y el saldo, es decir, la suma de DÓLARES ESTADOUNIDENSES BILLETE {saldoPalabras}, (U$S {saldoNum},) serán abonados por la PARTE COMPRADORA a la PARTE VENDEDORA EN {cantidadCuotas} CUOTAS, mensuales, iguales y consecutivas de DÓLARES ESTADOUNIDENSES BILLETE {cuotaMensualPalabras}, (U$S {cuotaMensual}),  en billetes de dicha moneda</w:t>
+      </w:r>
+      <w:r>
+        <w:rPr>
+          <w:rFonts w:ascii="Times New Roman" w:hAnsi="Times New Roman" w:cs="Times New Roman"/>
+          <w:color w:val="000000"/>
+          <w:sz w:val="24"/>
+          <w:szCs w:val="24"/>
+          <w:lang w:val="es-ES_tradnl"/>
+        </w:rPr>
+        <w:t>.</w:t>
+      </w:r>
+      <w:r>
+        <w:rPr>
+          <w:rFonts w:ascii="Times New Roman" w:hAnsi="Times New Roman" w:cs="Times New Roman"/>
+          <w:color w:val="000000"/>
+          <w:sz w:val="24"/>
+          <w:szCs w:val="24"/>
+          <w:lang w:val="es-ES_tradnl"/>
+        </w:rPr>
+        <w:t xml:space="preserve"> </w:t>
+      </w:r>
+      <w:r>
+        <w:rPr>
+          <w:rFonts w:ascii="Times New Roman" w:hAnsi="Times New Roman" w:cs="Times New Roman"/>
+          <w:color w:val="000000"/>
+          <w:sz w:val="24"/>
+          <w:szCs w:val="24"/>
+          <w:lang w:val="es-ES_tradnl"/>
+        </w:rPr>
+        <w:t>Al momento de realizar el último pago y saldar totalmente la deuda contraída, se celebrará la escritura</w:t>
+      </w:r>
+      <w:r>
+        <w:rPr>
+          <w:rFonts w:ascii="Times New Roman" w:hAnsi="Times New Roman" w:cs="Times New Roman"/>
+          <w:color w:val="000000"/>
+          <w:sz w:val="24"/>
+          <w:szCs w:val="24"/>
+          <w:lang w:val="es-ES_tradnl"/>
+        </w:rPr>
+        <w:t xml:space="preserve"> traslativa de dominio, en el lugar a designar por la PARTE </w:t>
+      </w:r>
+      <w:r>
+        <w:rPr>
+          <w:rFonts w:ascii="Times New Roman" w:hAnsi="Times New Roman" w:cs="Times New Roman"/>
+          <w:color w:val="000000"/>
+          <w:sz w:val="24"/>
+          <w:szCs w:val="24"/>
+          <w:lang w:val="es-ES_tradnl"/>
+        </w:rPr>
+        <w:t>VENDEDORA</w:t>
+      </w:r>
+      <w:r>
+        <w:rPr>
+          <w:rFonts w:ascii="Times New Roman" w:hAnsi="Times New Roman" w:cs="Times New Roman"/>
+          <w:color w:val="000000"/>
+          <w:sz w:val="24"/>
+          <w:szCs w:val="24"/>
+          <w:lang w:val="es-ES_tradnl"/>
+        </w:rPr>
+        <w:t xml:space="preserve"> dentro del radio de la Ciudad Autónoma de Buenos Aires.- Ambas partes manifiestan que otorgan plena validez al pago que se efectúan mediante el presente y expresan que no tienen reclamo que formularse y renuncian a invocar las acciones establecidas en los artículos 1083 a 1088 del Código Civil y Comercial de la Nación respecto al pacto comisorio, como así también renuncian a cualquier acción que les pudiera corresponder por incumplimiento de la ley 25.345. Las partes renuncian a la facultad de arrepentimiento prevista por el artículo 1059 del mencionado Código.-</w:t>
+      </w:r>
       <w:r>
         <w:rPr>
           <w:rFonts w:ascii="Times New Roman" w:hAnsi="Times New Roman" w:cs="Times New Roman"/>
@@ -524,7 +550,27 @@
           <w:szCs w:val="24"/>
           <w:lang w:val="es-ES_tradnl"/>
         </w:rPr>
-        <w:t xml:space="preserve">.- {#entregaCuota}La posesión será entregada por la PARTE VENDEDORA a la PARTE COMPRADORA contra el pago de la cuota N° {numeroCuotaEntrega}, libre de efectos y/u ocupantes y sin oposición de terceros; recibiéndola ésta última de conformidad.-{/entregaCuota}{#entregaAlSaldo}La posesión será entregada por la PARTE VENDEDORA a la PARTE COMPRADORA </w:t>
+        <w:t xml:space="preserve">.- {#entregaCuota}La posesión será entregada por la PARTE VENDEDORA a la PARTE COMPRADORA </w:t>
+      </w:r>
+      <w:r>
+        <w:rPr>
+          <w:rFonts w:ascii="Times New Roman" w:hAnsi="Times New Roman" w:cs="Times New Roman"/>
+          <w:color w:val="000000"/>
+          <w:sz w:val="24"/>
+          <w:szCs w:val="24"/>
+          <w:lang w:val="es-ES_tradnl"/>
+        </w:rPr>
+        <w:t xml:space="preserve">al momento de completarse el </w:t>
+      </w:r>
+      <w:r>
+        <w:rPr>
+          <w:rFonts w:ascii="Times New Roman" w:hAnsi="Times New Roman" w:cs="Times New Roman"/>
+          <w:color w:val="000000"/>
+          <w:sz w:val="24"/>
+          <w:szCs w:val="24"/>
+          <w:lang w:val="es-ES_tradnl"/>
+        </w:rPr>
+        <w:t xml:space="preserve">pago de la cuota N° {numeroCuotaEntrega}, libre de efectos y/u ocupantes y sin oposición de terceros; recibiéndola ésta última de conformidad.-{/entregaCuota}{#entregaAlSaldo}La posesión será entregada por la PARTE </w:t>
       </w:r>
       <w:r>
         <w:rPr>
@@ -535,7 +581,7 @@
           <w:lang w:val="es-ES_tradnl"/>
         </w:rPr>
         <w:lastRenderedPageBreak/>
-        <w:t xml:space="preserve">en oportunidad de suscribirse la escritura traslativa de dominio, libre de efectos y/u ocupantes y sin oposición de terceros; recibiéndola ésta última de conformidad.-{/entregaAlSaldo} </w:t>
+        <w:t xml:space="preserve">VENDEDORA a la PARTE COMPRADORA en oportunidad de suscribirse la escritura traslativa de dominio, libre de efectos y/u ocupantes y sin oposición de terceros; recibiéndola ésta última de conformidad.-{/entregaAlSaldo} </w:t>
       </w:r>
     </w:p>
     <w:p>
@@ -574,29 +620,27 @@
           <w:szCs w:val="24"/>
           <w:lang w:val="es-ES_tradnl"/>
         </w:rPr>
-        <w:t xml:space="preserve">: La escritura traslativa del dominio, se llevará a cabo a más tardar en un plazo no mayor a CIENTO OCHENTA DÍAS (180) días contados desde la fecha de pago total y recepción del recibo de la última cuota de la presente deuda, por ante el Escribano Sebastián Ezequiel Nadela, con oficinas en la calle Hipólito Yrigoyen 850, piso 3, oficina 332, de esta Ciudad, Titular del Registro Notarial Nº 1453, teléfonos 4334-1482, email sebastian@escribanianadela.com.ar / ap@escribanianadela.com.ar a quien las partes facultan para hacer las citaciones y emplazamientos de Acto Notarial. La fecha máxima de escrituración prevista podrá prorrogarse </w:t>
-      </w:r>
-      <w:proofErr w:type="gramStart"/>
-      <w:r>
-        <w:rPr>
-          <w:rFonts w:ascii="Times New Roman" w:hAnsi="Times New Roman" w:cs="Times New Roman"/>
-          <w:color w:val="000000"/>
-          <w:sz w:val="24"/>
-          <w:szCs w:val="24"/>
-          <w:lang w:val="es-ES_tradnl"/>
-        </w:rPr>
-        <w:t>en caso que</w:t>
-      </w:r>
-      <w:proofErr w:type="gramEnd"/>
-      <w:r>
-        <w:rPr>
-          <w:rFonts w:ascii="Times New Roman" w:hAnsi="Times New Roman" w:cs="Times New Roman"/>
-          <w:color w:val="000000"/>
-          <w:sz w:val="24"/>
-          <w:szCs w:val="24"/>
-          <w:lang w:val="es-ES_tradnl"/>
-        </w:rPr>
-        <w:t xml:space="preserve"> el trámite a realizar en el expediente sucesorio sufriera demoras por causas ajenas a la diligencia de la parte vendedora. Las partes asimismo se obligan a hacer entrega de la documentación correspondiente, como ser títulos originales. El pago de tasas, De corresponder, el impuesto a las ganancias, sellados, impuestos y demás erogaciones emergentes de la escritura traslativa de dominio serán soportados en su totalidad por la PARTE COMPRADORA, incluyendo el pago del impuesto de sellos que pudiera corresponder. </w:t>
+        <w:t>: La escritura traslativa del dominio, se llevará a cabo a más tardar en un plazo no mayor a CIENTO OCHENTA DÍAS (180) días contados desde la fecha de pago total y recepción del recibo de la última cuota de la presente deuda</w:t>
+      </w:r>
+      <w:r>
+        <w:rPr>
+          <w:rFonts w:ascii="Times New Roman" w:hAnsi="Times New Roman" w:cs="Times New Roman"/>
+          <w:color w:val="000000"/>
+          <w:sz w:val="24"/>
+          <w:szCs w:val="24"/>
+          <w:lang w:val="es-ES_tradnl"/>
+        </w:rPr>
+        <w:t xml:space="preserve"> adquirida</w:t>
+      </w:r>
+      <w:r>
+        <w:rPr>
+          <w:rFonts w:ascii="Times New Roman" w:hAnsi="Times New Roman" w:cs="Times New Roman"/>
+          <w:color w:val="000000"/>
+          <w:sz w:val="24"/>
+          <w:szCs w:val="24"/>
+          <w:lang w:val="es-ES_tradnl"/>
+        </w:rPr>
+        <w:t xml:space="preserve">, por ante el Escribano Sebastián Ezequiel Nadela, con oficinas en la calle Hipólito Yrigoyen 850, piso 3, oficina 332, de esta Ciudad, Titular del Registro Notarial Nº 1453, teléfonos 4334-1482, email sebastian@escribanianadela.com.ar / ap@escribanianadela.com.ar a quien las partes facultan para hacer las citaciones y emplazamientos de Acto Notarial. La fecha máxima de escrituración prevista podrá prorrogarse en caso que el trámite a realizar en el expediente sucesorio sufriera demoras por causas ajenas a la diligencia de la parte vendedora. Las partes asimismo se obligan a hacer entrega de la documentación correspondiente, como ser títulos originales. El pago de tasas, De corresponder, el impuesto a las ganancias, sellados, impuestos y demás erogaciones emergentes de la escritura traslativa de dominio serán soportados en su totalidad por la PARTE COMPRADORA, incluyendo el pago del impuesto de sellos que pudiera corresponder. </w:t>
       </w:r>
     </w:p>
     <w:p>

</xml_diff>

<commit_message>
Update boleto template artifacts
</commit_message>
<xml_diff>
--- a/src/templates/boleto-template-cuotas.docx
+++ b/src/templates/boleto-template-cuotas.docx
@@ -57,7 +57,183 @@
           <w:szCs w:val="24"/>
           <w:lang w:val="es-ES_tradnl"/>
         </w:rPr>
-        <w:t xml:space="preserve">En la Ciudad Autónoma de Buenos Aires, a los {dia} días del mes de {mes} de {anioLetras}, quienes suscriben, por una parte: 1) MIGUEL ÁNGEL LÁZZARO, argentino, titular del Documento Nacional de Identidad 8.206.039 y del CUIL 20-08206039-2, domiciliado en la calle Ladislao Martínez 243 Piso 2, Localidad de Martínez, Partido de San Isidro, Provincia de Buenos Aires, quien interviene en nombre y representación, en su carácter de Presidente de la Sociedad que gira en esta plaza, bajo la denominación de “BARRIO STEFANI SOCIEDAD ANÓNIMA”, CUIT 30-71917882-7, con sede social en la calle Talcahuano 469, Piso 2, de ésta Ciudad, en adelante denominado “Parte Vendedora"; y por la otra parte: 2) {nombreComprador}, {nacionalidad}, nacido el {fechaNacimientoLetras}, {estadoCivil}, titular del Documento Nacional de Identidad {dniComprador}, CUIT {cuitComprador}, domiciliado en {domicilioComprador}, en adelante denominado "Parte Compradora", y conjuntamente denominadas "Las Partes"; han convenido en celebrar el presente BOLETO DE COMPRA-VENTA INMOBILIARIA, sujeto a las siguientes cláusulas y condiciones: </w:t>
+        <w:t>En la Ciudad Autónoma de Buenos Aires, a los {</w:t>
+      </w:r>
+      <w:proofErr w:type="spellStart"/>
+      <w:r>
+        <w:rPr>
+          <w:rFonts w:ascii="Times New Roman" w:hAnsi="Times New Roman" w:cs="Times New Roman"/>
+          <w:color w:val="000000"/>
+          <w:sz w:val="24"/>
+          <w:szCs w:val="24"/>
+          <w:lang w:val="es-ES_tradnl"/>
+        </w:rPr>
+        <w:t>dia</w:t>
+      </w:r>
+      <w:proofErr w:type="spellEnd"/>
+      <w:r>
+        <w:rPr>
+          <w:rFonts w:ascii="Times New Roman" w:hAnsi="Times New Roman" w:cs="Times New Roman"/>
+          <w:color w:val="000000"/>
+          <w:sz w:val="24"/>
+          <w:szCs w:val="24"/>
+          <w:lang w:val="es-ES_tradnl"/>
+        </w:rPr>
+        <w:t>} días del mes de {mes} de {</w:t>
+      </w:r>
+      <w:proofErr w:type="spellStart"/>
+      <w:r>
+        <w:rPr>
+          <w:rFonts w:ascii="Times New Roman" w:hAnsi="Times New Roman" w:cs="Times New Roman"/>
+          <w:color w:val="000000"/>
+          <w:sz w:val="24"/>
+          <w:szCs w:val="24"/>
+          <w:lang w:val="es-ES_tradnl"/>
+        </w:rPr>
+        <w:t>anioLetras</w:t>
+      </w:r>
+      <w:proofErr w:type="spellEnd"/>
+      <w:r>
+        <w:rPr>
+          <w:rFonts w:ascii="Times New Roman" w:hAnsi="Times New Roman" w:cs="Times New Roman"/>
+          <w:color w:val="000000"/>
+          <w:sz w:val="24"/>
+          <w:szCs w:val="24"/>
+          <w:lang w:val="es-ES_tradnl"/>
+        </w:rPr>
+        <w:t>}, quienes suscriben, por una parte: 1) MIGUEL ÁNGEL LÁZZARO, argentino, titular del Documento Nacional de Identidad 8.206.039 y del CUIL 20-08206039-2, domiciliado en la calle Ladislao Martínez 243 Piso 2, Localidad de Martínez, Partido de San Isidro, Provincia de Buenos Aires, quien interviene en nombre y representación, en su carácter de Presidente de la Sociedad que gira en esta plaza, bajo la denominación de “BARRIO STEFANI SOCIEDAD ANÓNIMA”, CUIT 30-71917882-7, con sede social en la calle Talcahuano 469, Piso 2, de ésta Ciudad, en adelante denominado “Parte Vendedora"; y por la otra parte: 2) {</w:t>
+      </w:r>
+      <w:proofErr w:type="spellStart"/>
+      <w:r>
+        <w:rPr>
+          <w:rFonts w:ascii="Times New Roman" w:hAnsi="Times New Roman" w:cs="Times New Roman"/>
+          <w:color w:val="000000"/>
+          <w:sz w:val="24"/>
+          <w:szCs w:val="24"/>
+          <w:lang w:val="es-ES_tradnl"/>
+        </w:rPr>
+        <w:t>nombreComprador</w:t>
+      </w:r>
+      <w:proofErr w:type="spellEnd"/>
+      <w:r>
+        <w:rPr>
+          <w:rFonts w:ascii="Times New Roman" w:hAnsi="Times New Roman" w:cs="Times New Roman"/>
+          <w:color w:val="000000"/>
+          <w:sz w:val="24"/>
+          <w:szCs w:val="24"/>
+          <w:lang w:val="es-ES_tradnl"/>
+        </w:rPr>
+        <w:t>}, {nacionalidad}, nacido el {</w:t>
+      </w:r>
+      <w:proofErr w:type="spellStart"/>
+      <w:r>
+        <w:rPr>
+          <w:rFonts w:ascii="Times New Roman" w:hAnsi="Times New Roman" w:cs="Times New Roman"/>
+          <w:color w:val="000000"/>
+          <w:sz w:val="24"/>
+          <w:szCs w:val="24"/>
+          <w:lang w:val="es-ES_tradnl"/>
+        </w:rPr>
+        <w:t>fechaNacimientoLetras</w:t>
+      </w:r>
+      <w:proofErr w:type="spellEnd"/>
+      <w:r>
+        <w:rPr>
+          <w:rFonts w:ascii="Times New Roman" w:hAnsi="Times New Roman" w:cs="Times New Roman"/>
+          <w:color w:val="000000"/>
+          <w:sz w:val="24"/>
+          <w:szCs w:val="24"/>
+          <w:lang w:val="es-ES_tradnl"/>
+        </w:rPr>
+        <w:t>}, {</w:t>
+      </w:r>
+      <w:proofErr w:type="spellStart"/>
+      <w:r>
+        <w:rPr>
+          <w:rFonts w:ascii="Times New Roman" w:hAnsi="Times New Roman" w:cs="Times New Roman"/>
+          <w:color w:val="000000"/>
+          <w:sz w:val="24"/>
+          <w:szCs w:val="24"/>
+          <w:lang w:val="es-ES_tradnl"/>
+        </w:rPr>
+        <w:t>estadoCivil</w:t>
+      </w:r>
+      <w:proofErr w:type="spellEnd"/>
+      <w:r>
+        <w:rPr>
+          <w:rFonts w:ascii="Times New Roman" w:hAnsi="Times New Roman" w:cs="Times New Roman"/>
+          <w:color w:val="000000"/>
+          <w:sz w:val="24"/>
+          <w:szCs w:val="24"/>
+          <w:lang w:val="es-ES_tradnl"/>
+        </w:rPr>
+        <w:t>}, titular del Documento Nacional de Identidad {</w:t>
+      </w:r>
+      <w:proofErr w:type="spellStart"/>
+      <w:r>
+        <w:rPr>
+          <w:rFonts w:ascii="Times New Roman" w:hAnsi="Times New Roman" w:cs="Times New Roman"/>
+          <w:color w:val="000000"/>
+          <w:sz w:val="24"/>
+          <w:szCs w:val="24"/>
+          <w:lang w:val="es-ES_tradnl"/>
+        </w:rPr>
+        <w:t>dniComprador</w:t>
+      </w:r>
+      <w:proofErr w:type="spellEnd"/>
+      <w:r>
+        <w:rPr>
+          <w:rFonts w:ascii="Times New Roman" w:hAnsi="Times New Roman" w:cs="Times New Roman"/>
+          <w:color w:val="000000"/>
+          <w:sz w:val="24"/>
+          <w:szCs w:val="24"/>
+          <w:lang w:val="es-ES_tradnl"/>
+        </w:rPr>
+        <w:t>}, CUIT {</w:t>
+      </w:r>
+      <w:proofErr w:type="spellStart"/>
+      <w:r>
+        <w:rPr>
+          <w:rFonts w:ascii="Times New Roman" w:hAnsi="Times New Roman" w:cs="Times New Roman"/>
+          <w:color w:val="000000"/>
+          <w:sz w:val="24"/>
+          <w:szCs w:val="24"/>
+          <w:lang w:val="es-ES_tradnl"/>
+        </w:rPr>
+        <w:t>cuitComprador</w:t>
+      </w:r>
+      <w:proofErr w:type="spellEnd"/>
+      <w:r>
+        <w:rPr>
+          <w:rFonts w:ascii="Times New Roman" w:hAnsi="Times New Roman" w:cs="Times New Roman"/>
+          <w:color w:val="000000"/>
+          <w:sz w:val="24"/>
+          <w:szCs w:val="24"/>
+          <w:lang w:val="es-ES_tradnl"/>
+        </w:rPr>
+        <w:t>}, domiciliado en {</w:t>
+      </w:r>
+      <w:proofErr w:type="spellStart"/>
+      <w:r>
+        <w:rPr>
+          <w:rFonts w:ascii="Times New Roman" w:hAnsi="Times New Roman" w:cs="Times New Roman"/>
+          <w:color w:val="000000"/>
+          <w:sz w:val="24"/>
+          <w:szCs w:val="24"/>
+          <w:lang w:val="es-ES_tradnl"/>
+        </w:rPr>
+        <w:t>domicilioComprador</w:t>
+      </w:r>
+      <w:proofErr w:type="spellEnd"/>
+      <w:r>
+        <w:rPr>
+          <w:rFonts w:ascii="Times New Roman" w:hAnsi="Times New Roman" w:cs="Times New Roman"/>
+          <w:color w:val="000000"/>
+          <w:sz w:val="24"/>
+          <w:szCs w:val="24"/>
+          <w:lang w:val="es-ES_tradnl"/>
+        </w:rPr>
+        <w:t xml:space="preserve">}, en adelante denominado "Parte Compradora", y conjuntamente denominadas "Las Partes"; han convenido en celebrar el presente BOLETO DE COMPRA-VENTA INMOBILIARIA, sujeto a las siguientes cláusulas y condiciones: </w:t>
       </w:r>
     </w:p>
     <w:p>
@@ -99,7 +275,73 @@
           <w:szCs w:val="24"/>
           <w:lang w:val="es-ES_tradnl"/>
         </w:rPr>
-        <w:t>: La parte VENDEDORA VENDE a la PARTE COMPRADORA, el siguiente inmueble de su propiedad: un LOTE ubicado en la Sección IV, en la LOCALIDAD Y PARTIDO DE MORENO, PROVINCIA DE BUENOS AIRES, con frente a la calle {calleInmueble}, entre las calles {limites}, designado según {tituloPlano}, como LOTE {lote} DE LA MANZANA {manzana}, el cual consta de las siguientes medidas, linderos y superficies: {medidas}.- NOMENCLATURA CATASTRAL: Circunscripción V, Sección F, Manzana {manzana}, Parcela {parcelaCatastral}.- PARTIDA INMOBILIARIA: 074-{partida}.- Inscripto su dominio en el Registro de la Propiedad Inmueble en la Matrícula {matricula}</w:t>
+        <w:t>: La parte VENDEDORA VENDE a la PARTE COMPRADORA, el siguiente inmueble de su propiedad: un LOTE ubicado en la Sección IV, en la LOCALIDAD Y PARTIDO DE MORENO, PROVINCIA DE BUENOS AIRES, con frente a la calle {</w:t>
+      </w:r>
+      <w:proofErr w:type="spellStart"/>
+      <w:r>
+        <w:rPr>
+          <w:rFonts w:ascii="Times New Roman" w:hAnsi="Times New Roman" w:cs="Times New Roman"/>
+          <w:color w:val="000000"/>
+          <w:sz w:val="24"/>
+          <w:szCs w:val="24"/>
+          <w:lang w:val="es-ES_tradnl"/>
+        </w:rPr>
+        <w:t>calleInmueble</w:t>
+      </w:r>
+      <w:proofErr w:type="spellEnd"/>
+      <w:r>
+        <w:rPr>
+          <w:rFonts w:ascii="Times New Roman" w:hAnsi="Times New Roman" w:cs="Times New Roman"/>
+          <w:color w:val="000000"/>
+          <w:sz w:val="24"/>
+          <w:szCs w:val="24"/>
+          <w:lang w:val="es-ES_tradnl"/>
+        </w:rPr>
+        <w:t>}, entre las calles {limites}, designado según {</w:t>
+      </w:r>
+      <w:proofErr w:type="spellStart"/>
+      <w:r>
+        <w:rPr>
+          <w:rFonts w:ascii="Times New Roman" w:hAnsi="Times New Roman" w:cs="Times New Roman"/>
+          <w:color w:val="000000"/>
+          <w:sz w:val="24"/>
+          <w:szCs w:val="24"/>
+          <w:lang w:val="es-ES_tradnl"/>
+        </w:rPr>
+        <w:t>tituloPlano</w:t>
+      </w:r>
+      <w:proofErr w:type="spellEnd"/>
+      <w:r>
+        <w:rPr>
+          <w:rFonts w:ascii="Times New Roman" w:hAnsi="Times New Roman" w:cs="Times New Roman"/>
+          <w:color w:val="000000"/>
+          <w:sz w:val="24"/>
+          <w:szCs w:val="24"/>
+          <w:lang w:val="es-ES_tradnl"/>
+        </w:rPr>
+        <w:t>}, como LOTE {lote} DE LA MANZANA {manzana}, el cual consta de las siguientes medidas, linderos y superficies: {medidas}.- NOMENCLATURA CATASTRAL: Circunscripción V, Sección F, Manzana {manzana}, Parcela {</w:t>
+      </w:r>
+      <w:proofErr w:type="spellStart"/>
+      <w:r>
+        <w:rPr>
+          <w:rFonts w:ascii="Times New Roman" w:hAnsi="Times New Roman" w:cs="Times New Roman"/>
+          <w:color w:val="000000"/>
+          <w:sz w:val="24"/>
+          <w:szCs w:val="24"/>
+          <w:lang w:val="es-ES_tradnl"/>
+        </w:rPr>
+        <w:t>parcelaCatastral</w:t>
+      </w:r>
+      <w:proofErr w:type="spellEnd"/>
+      <w:r>
+        <w:rPr>
+          <w:rFonts w:ascii="Times New Roman" w:hAnsi="Times New Roman" w:cs="Times New Roman"/>
+          <w:color w:val="000000"/>
+          <w:sz w:val="24"/>
+          <w:szCs w:val="24"/>
+          <w:lang w:val="es-ES_tradnl"/>
+        </w:rPr>
+        <w:t>}.- PARTIDA INMOBILIARIA: 074-{partida}.- Inscripto su dominio en el Registro de la Propiedad Inmueble en la Matrícula {matricula}</w:t>
       </w:r>
     </w:p>
     <w:p>
@@ -149,7 +391,95 @@
           <w:lang w:val="es-ES_tradnl"/>
         </w:rPr>
         <w:lastRenderedPageBreak/>
-        <w:t>y A., según escritura {escritura} de fecha {fechaEscritura}, pasada ante el Escribano de ésta Ciudad, Sebastián E. Nadela, al folio {folio} del Registro 1.453 a su cargo, cuya Primera Copia se inscribió en el Registro de la Propiedad Inmueble de la Provincia de Buenos Aires, con fecha {fechaEscritura}, en la Matrícula {matriculaSegunda}</w:t>
+        <w:t>y A., según escritura {escritura} de fecha {</w:t>
+      </w:r>
+      <w:proofErr w:type="spellStart"/>
+      <w:r>
+        <w:rPr>
+          <w:rFonts w:ascii="Times New Roman" w:hAnsi="Times New Roman" w:cs="Times New Roman"/>
+          <w:color w:val="000000"/>
+          <w:sz w:val="24"/>
+          <w:szCs w:val="24"/>
+          <w:lang w:val="es-ES_tradnl"/>
+        </w:rPr>
+        <w:t>fechaEscritura</w:t>
+      </w:r>
+      <w:proofErr w:type="spellEnd"/>
+      <w:r>
+        <w:rPr>
+          <w:rFonts w:ascii="Times New Roman" w:hAnsi="Times New Roman" w:cs="Times New Roman"/>
+          <w:color w:val="000000"/>
+          <w:sz w:val="24"/>
+          <w:szCs w:val="24"/>
+          <w:lang w:val="es-ES_tradnl"/>
+        </w:rPr>
+        <w:t xml:space="preserve">}, pasada ante el Escribano de </w:t>
+      </w:r>
+      <w:proofErr w:type="gramStart"/>
+      <w:r>
+        <w:rPr>
+          <w:rFonts w:ascii="Times New Roman" w:hAnsi="Times New Roman" w:cs="Times New Roman"/>
+          <w:color w:val="000000"/>
+          <w:sz w:val="24"/>
+          <w:szCs w:val="24"/>
+          <w:lang w:val="es-ES_tradnl"/>
+        </w:rPr>
+        <w:t>ésta</w:t>
+      </w:r>
+      <w:proofErr w:type="gramEnd"/>
+      <w:r>
+        <w:rPr>
+          <w:rFonts w:ascii="Times New Roman" w:hAnsi="Times New Roman" w:cs="Times New Roman"/>
+          <w:color w:val="000000"/>
+          <w:sz w:val="24"/>
+          <w:szCs w:val="24"/>
+          <w:lang w:val="es-ES_tradnl"/>
+        </w:rPr>
+        <w:t xml:space="preserve"> Ciudad, Sebastián E. Nadela, al folio {folio} del Registro 1.453 a su cargo, cuya Primera Copia se inscribió en el Registro de la Propiedad Inmueble de la Provincia de Buenos Aires, con fecha {</w:t>
+      </w:r>
+      <w:proofErr w:type="spellStart"/>
+      <w:r>
+        <w:rPr>
+          <w:rFonts w:ascii="Times New Roman" w:hAnsi="Times New Roman" w:cs="Times New Roman"/>
+          <w:color w:val="000000"/>
+          <w:sz w:val="24"/>
+          <w:szCs w:val="24"/>
+          <w:lang w:val="es-ES_tradnl"/>
+        </w:rPr>
+        <w:t>fechaEscritura</w:t>
+      </w:r>
+      <w:proofErr w:type="spellEnd"/>
+      <w:r>
+        <w:rPr>
+          <w:rFonts w:ascii="Times New Roman" w:hAnsi="Times New Roman" w:cs="Times New Roman"/>
+          <w:color w:val="000000"/>
+          <w:sz w:val="24"/>
+          <w:szCs w:val="24"/>
+          <w:lang w:val="es-ES_tradnl"/>
+        </w:rPr>
+        <w:t>}, en la Matrícula {</w:t>
+      </w:r>
+      <w:proofErr w:type="spellStart"/>
+      <w:r>
+        <w:rPr>
+          <w:rFonts w:ascii="Times New Roman" w:hAnsi="Times New Roman" w:cs="Times New Roman"/>
+          <w:color w:val="000000"/>
+          <w:sz w:val="24"/>
+          <w:szCs w:val="24"/>
+          <w:lang w:val="es-ES_tradnl"/>
+        </w:rPr>
+        <w:t>matriculaSegunda</w:t>
+      </w:r>
+      <w:proofErr w:type="spellEnd"/>
+      <w:r>
+        <w:rPr>
+          <w:rFonts w:ascii="Times New Roman" w:hAnsi="Times New Roman" w:cs="Times New Roman"/>
+          <w:color w:val="000000"/>
+          <w:sz w:val="24"/>
+          <w:szCs w:val="24"/>
+          <w:lang w:val="es-ES_tradnl"/>
+        </w:rPr>
+        <w:t>}</w:t>
       </w:r>
       <w:r>
         <w:rPr>
@@ -198,25 +528,352 @@
           <w:szCs w:val="24"/>
           <w:lang w:val="es-ES_tradnl"/>
         </w:rPr>
-        <w:t>: Esta venta se realiza por el precio total y convenido de DÓLARES ESTADOUNIDENSES BILLETE {precioTotalPalabras}, (U$S {precioTotalNum}, que la PARTE COMPRADORA abonará a la PARTE VENDEDORA de la siguiente manera: la suma de DÓLARES ESTADOUNIDENSES BILLETE {anticipoPalabras}, (U$S {anticipoNum},) la PARTE COMPRADORA entrega la PARTE VENDEDORA en este acto, en billetes de dicha moneda, a cuenta de precio y como principio de ejecución del contrato, sirviendo el presente de suficiente recibo y carta de pago en forma; y el saldo, es decir, la suma de DÓLARES ESTADOUNIDENSES BILLETE {saldoPalabras}, (U$S {saldoNum},) serán abonados por la PARTE COMPRADORA a la PARTE VENDEDORA EN {cantidadCuotas} CUOTAS, mensuales, iguales y consecutivas de DÓLARES ESTADOUNIDENSES BILLETE {cuotaMensualPalabras}, (U$S {cuotaMensual}),  en billetes de dicha moneda</w:t>
-      </w:r>
-      <w:r>
-        <w:rPr>
-          <w:rFonts w:ascii="Times New Roman" w:hAnsi="Times New Roman" w:cs="Times New Roman"/>
-          <w:color w:val="000000"/>
-          <w:sz w:val="24"/>
-          <w:szCs w:val="24"/>
-          <w:lang w:val="es-ES_tradnl"/>
-        </w:rPr>
-        <w:t>.</w:t>
-      </w:r>
-      <w:r>
-        <w:rPr>
-          <w:rFonts w:ascii="Times New Roman" w:hAnsi="Times New Roman" w:cs="Times New Roman"/>
-          <w:color w:val="000000"/>
-          <w:sz w:val="24"/>
-          <w:szCs w:val="24"/>
-          <w:lang w:val="es-ES_tradnl"/>
+        <w:t>: Esta venta se realiza por el precio total y convenido de DÓLARES ESTADOUNIDENSES BILLETE {</w:t>
+      </w:r>
+      <w:proofErr w:type="spellStart"/>
+      <w:r>
+        <w:rPr>
+          <w:rFonts w:ascii="Times New Roman" w:hAnsi="Times New Roman" w:cs="Times New Roman"/>
+          <w:color w:val="000000"/>
+          <w:sz w:val="24"/>
+          <w:szCs w:val="24"/>
+          <w:lang w:val="es-ES_tradnl"/>
+        </w:rPr>
+        <w:t>precioTotalPalabras</w:t>
+      </w:r>
+      <w:proofErr w:type="spellEnd"/>
+      <w:r>
+        <w:rPr>
+          <w:rFonts w:ascii="Times New Roman" w:hAnsi="Times New Roman" w:cs="Times New Roman"/>
+          <w:color w:val="000000"/>
+          <w:sz w:val="24"/>
+          <w:szCs w:val="24"/>
+          <w:lang w:val="es-ES_tradnl"/>
+        </w:rPr>
+        <w:t>}, (U$S {</w:t>
+      </w:r>
+      <w:proofErr w:type="spellStart"/>
+      <w:r>
+        <w:rPr>
+          <w:rFonts w:ascii="Times New Roman" w:hAnsi="Times New Roman" w:cs="Times New Roman"/>
+          <w:color w:val="000000"/>
+          <w:sz w:val="24"/>
+          <w:szCs w:val="24"/>
+          <w:lang w:val="es-ES_tradnl"/>
+        </w:rPr>
+        <w:t>precioTotalNum</w:t>
+      </w:r>
+      <w:proofErr w:type="spellEnd"/>
+      <w:r>
+        <w:rPr>
+          <w:rFonts w:ascii="Times New Roman" w:hAnsi="Times New Roman" w:cs="Times New Roman"/>
+          <w:color w:val="000000"/>
+          <w:sz w:val="24"/>
+          <w:szCs w:val="24"/>
+          <w:lang w:val="es-ES_tradnl"/>
+        </w:rPr>
+        <w:t>}</w:t>
+      </w:r>
+      <w:r>
+        <w:rPr>
+          <w:rFonts w:ascii="Times New Roman" w:hAnsi="Times New Roman" w:cs="Times New Roman"/>
+          <w:color w:val="000000"/>
+          <w:sz w:val="24"/>
+          <w:szCs w:val="24"/>
+          <w:lang w:val="es-ES_tradnl"/>
+        </w:rPr>
+        <w:t>)</w:t>
+      </w:r>
+      <w:r>
+        <w:rPr>
+          <w:rFonts w:ascii="Times New Roman" w:hAnsi="Times New Roman" w:cs="Times New Roman"/>
+          <w:color w:val="000000"/>
+          <w:sz w:val="24"/>
+          <w:szCs w:val="24"/>
+          <w:lang w:val="es-ES_tradnl"/>
+        </w:rPr>
+        <w:t>, que la PARTE COMPRADORA abonará a la PARTE VENDEDORA de la siguiente manera: la suma de DÓLARES ESTADOUNIDENSES BILLETE {</w:t>
+      </w:r>
+      <w:proofErr w:type="spellStart"/>
+      <w:r>
+        <w:rPr>
+          <w:rFonts w:ascii="Times New Roman" w:hAnsi="Times New Roman" w:cs="Times New Roman"/>
+          <w:color w:val="000000"/>
+          <w:sz w:val="24"/>
+          <w:szCs w:val="24"/>
+          <w:lang w:val="es-ES_tradnl"/>
+        </w:rPr>
+        <w:t>anticipoPalabras</w:t>
+      </w:r>
+      <w:proofErr w:type="spellEnd"/>
+      <w:r>
+        <w:rPr>
+          <w:rFonts w:ascii="Times New Roman" w:hAnsi="Times New Roman" w:cs="Times New Roman"/>
+          <w:color w:val="000000"/>
+          <w:sz w:val="24"/>
+          <w:szCs w:val="24"/>
+          <w:lang w:val="es-ES_tradnl"/>
+        </w:rPr>
+        <w:t>}, (U$S {</w:t>
+      </w:r>
+      <w:proofErr w:type="spellStart"/>
+      <w:r>
+        <w:rPr>
+          <w:rFonts w:ascii="Times New Roman" w:hAnsi="Times New Roman" w:cs="Times New Roman"/>
+          <w:color w:val="000000"/>
+          <w:sz w:val="24"/>
+          <w:szCs w:val="24"/>
+          <w:lang w:val="es-ES_tradnl"/>
+        </w:rPr>
+        <w:t>anticipoNum</w:t>
+      </w:r>
+      <w:proofErr w:type="spellEnd"/>
+      <w:r>
+        <w:rPr>
+          <w:rFonts w:ascii="Times New Roman" w:hAnsi="Times New Roman" w:cs="Times New Roman"/>
+          <w:color w:val="000000"/>
+          <w:sz w:val="24"/>
+          <w:szCs w:val="24"/>
+          <w:lang w:val="es-ES_tradnl"/>
+        </w:rPr>
+        <w:t xml:space="preserve">},) </w:t>
+      </w:r>
+      <w:r>
+        <w:rPr>
+          <w:rFonts w:ascii="Times New Roman" w:hAnsi="Times New Roman" w:cs="Times New Roman"/>
+          <w:color w:val="000000"/>
+          <w:sz w:val="24"/>
+          <w:szCs w:val="24"/>
+          <w:lang w:val="es-ES_tradnl"/>
+        </w:rPr>
+        <w:t xml:space="preserve">que </w:t>
+      </w:r>
+      <w:r>
+        <w:rPr>
+          <w:rFonts w:ascii="Times New Roman" w:hAnsi="Times New Roman" w:cs="Times New Roman"/>
+          <w:color w:val="000000"/>
+          <w:sz w:val="24"/>
+          <w:szCs w:val="24"/>
+          <w:lang w:val="es-ES_tradnl"/>
+        </w:rPr>
+        <w:t xml:space="preserve">la PARTE COMPRADORA entrega </w:t>
+      </w:r>
+      <w:r>
+        <w:rPr>
+          <w:rFonts w:ascii="Times New Roman" w:hAnsi="Times New Roman" w:cs="Times New Roman"/>
+          <w:color w:val="000000"/>
+          <w:sz w:val="24"/>
+          <w:szCs w:val="24"/>
+          <w:lang w:val="es-ES_tradnl"/>
+        </w:rPr>
+        <w:t xml:space="preserve">a </w:t>
+      </w:r>
+      <w:r>
+        <w:rPr>
+          <w:rFonts w:ascii="Times New Roman" w:hAnsi="Times New Roman" w:cs="Times New Roman"/>
+          <w:color w:val="000000"/>
+          <w:sz w:val="24"/>
+          <w:szCs w:val="24"/>
+          <w:lang w:val="es-ES_tradnl"/>
+        </w:rPr>
+        <w:t>la PARTE VENDEDORA en este acto, en billetes de dicha moneda, a cuenta de precio y como principio de ejecución del contrato, sirviendo el presente de suficiente recibo y carta de pago en forma</w:t>
+      </w:r>
+      <w:r>
+        <w:rPr>
+          <w:rFonts w:ascii="Times New Roman" w:hAnsi="Times New Roman" w:cs="Times New Roman"/>
+          <w:color w:val="000000"/>
+          <w:sz w:val="24"/>
+          <w:szCs w:val="24"/>
+          <w:lang w:val="es-ES_tradnl"/>
+        </w:rPr>
+        <w:t>. Y e</w:t>
+      </w:r>
+      <w:r>
+        <w:rPr>
+          <w:rFonts w:ascii="Times New Roman" w:hAnsi="Times New Roman" w:cs="Times New Roman"/>
+          <w:color w:val="000000"/>
+          <w:sz w:val="24"/>
+          <w:szCs w:val="24"/>
+        </w:rPr>
+        <w:t>l saldo, es decir, la suma de DÓLARES ESTADOUNIDENSES BILLETE {</w:t>
+      </w:r>
+      <w:proofErr w:type="spellStart"/>
+      <w:r>
+        <w:rPr>
+          <w:rFonts w:ascii="Times New Roman" w:hAnsi="Times New Roman" w:cs="Times New Roman"/>
+          <w:color w:val="000000"/>
+          <w:sz w:val="24"/>
+          <w:szCs w:val="24"/>
+        </w:rPr>
+        <w:t>saldoPalabras</w:t>
+      </w:r>
+      <w:proofErr w:type="spellEnd"/>
+      <w:r>
+        <w:rPr>
+          <w:rFonts w:ascii="Times New Roman" w:hAnsi="Times New Roman" w:cs="Times New Roman"/>
+          <w:color w:val="000000"/>
+          <w:sz w:val="24"/>
+          <w:szCs w:val="24"/>
+        </w:rPr>
+        <w:t>}, (U$S {</w:t>
+      </w:r>
+      <w:proofErr w:type="spellStart"/>
+      <w:r>
+        <w:rPr>
+          <w:rFonts w:ascii="Times New Roman" w:hAnsi="Times New Roman" w:cs="Times New Roman"/>
+          <w:color w:val="000000"/>
+          <w:sz w:val="24"/>
+          <w:szCs w:val="24"/>
+        </w:rPr>
+        <w:t>saldoNum</w:t>
+      </w:r>
+      <w:proofErr w:type="spellEnd"/>
+      <w:r>
+        <w:rPr>
+          <w:rFonts w:ascii="Times New Roman" w:hAnsi="Times New Roman" w:cs="Times New Roman"/>
+          <w:color w:val="000000"/>
+          <w:sz w:val="24"/>
+          <w:szCs w:val="24"/>
+        </w:rPr>
+        <w:t>}),</w:t>
+      </w:r>
+      <w:r>
+        <w:rPr>
+          <w:rFonts w:ascii="Times New Roman" w:hAnsi="Times New Roman" w:cs="Times New Roman"/>
+          <w:color w:val="000000"/>
+          <w:sz w:val="24"/>
+          <w:szCs w:val="24"/>
+        </w:rPr>
+        <w:t xml:space="preserve"> equivalente</w:t>
+      </w:r>
+      <w:r>
+        <w:rPr>
+          <w:rFonts w:ascii="Times New Roman" w:hAnsi="Times New Roman" w:cs="Times New Roman"/>
+          <w:color w:val="000000"/>
+          <w:sz w:val="24"/>
+          <w:szCs w:val="24"/>
+        </w:rPr>
+        <w:t>s</w:t>
+      </w:r>
+      <w:r>
+        <w:rPr>
+          <w:rFonts w:ascii="Times New Roman" w:hAnsi="Times New Roman" w:cs="Times New Roman"/>
+          <w:color w:val="000000"/>
+          <w:sz w:val="24"/>
+          <w:szCs w:val="24"/>
+        </w:rPr>
+        <w:t xml:space="preserve"> a </w:t>
+      </w:r>
+      <w:r>
+        <w:rPr>
+          <w:rFonts w:ascii="Times New Roman" w:hAnsi="Times New Roman" w:cs="Times New Roman"/>
+          <w:color w:val="000000"/>
+          <w:sz w:val="24"/>
+          <w:szCs w:val="24"/>
+          <w:lang w:val="es-ES"/>
+        </w:rPr>
+        <w:t>{</w:t>
+      </w:r>
+      <w:proofErr w:type="spellStart"/>
+      <w:r>
+        <w:rPr>
+          <w:rFonts w:ascii="Times New Roman" w:hAnsi="Times New Roman" w:cs="Times New Roman"/>
+          <w:color w:val="000000"/>
+          <w:sz w:val="24"/>
+          <w:szCs w:val="24"/>
+          <w:lang w:val="es-ES"/>
+        </w:rPr>
+        <w:t>s</w:t>
+      </w:r>
+      <w:r>
+        <w:rPr>
+          <w:rFonts w:ascii="Times New Roman" w:hAnsi="Times New Roman" w:cs="Times New Roman"/>
+          <w:color w:val="000000"/>
+          <w:sz w:val="24"/>
+          <w:szCs w:val="24"/>
+          <w:lang w:val="es-ES"/>
+        </w:rPr>
+        <w:t>aldoPesosPalabras</w:t>
+      </w:r>
+      <w:proofErr w:type="spellEnd"/>
+      <w:r>
+        <w:rPr>
+          <w:rFonts w:ascii="Times New Roman" w:hAnsi="Times New Roman" w:cs="Times New Roman"/>
+          <w:color w:val="000000"/>
+          <w:sz w:val="24"/>
+          <w:szCs w:val="24"/>
+          <w:lang w:val="es-ES"/>
+        </w:rPr>
+        <w:t>} (AR$ {</w:t>
+      </w:r>
+      <w:proofErr w:type="spellStart"/>
+      <w:r>
+        <w:rPr>
+          <w:rFonts w:ascii="Times New Roman" w:hAnsi="Times New Roman" w:cs="Times New Roman"/>
+          <w:color w:val="000000"/>
+          <w:sz w:val="24"/>
+          <w:szCs w:val="24"/>
+          <w:lang w:val="es-ES"/>
+        </w:rPr>
+        <w:t>saldoPesosNum</w:t>
+      </w:r>
+      <w:proofErr w:type="spellEnd"/>
+      <w:r>
+        <w:rPr>
+          <w:rFonts w:ascii="Times New Roman" w:hAnsi="Times New Roman" w:cs="Times New Roman"/>
+          <w:color w:val="000000"/>
+          <w:sz w:val="24"/>
+          <w:szCs w:val="24"/>
+          <w:lang w:val="es-ES"/>
+        </w:rPr>
+        <w:t>}) que surge</w:t>
+      </w:r>
+      <w:r>
+        <w:rPr>
+          <w:rFonts w:ascii="Times New Roman" w:hAnsi="Times New Roman" w:cs="Times New Roman"/>
+          <w:color w:val="000000"/>
+          <w:sz w:val="24"/>
+          <w:szCs w:val="24"/>
+          <w:lang w:val="es-ES"/>
+        </w:rPr>
+        <w:t>n</w:t>
+      </w:r>
+      <w:r>
+        <w:rPr>
+          <w:rFonts w:ascii="Times New Roman" w:hAnsi="Times New Roman" w:cs="Times New Roman"/>
+          <w:color w:val="000000"/>
+          <w:sz w:val="24"/>
+          <w:szCs w:val="24"/>
+          <w:lang w:val="es-ES"/>
+        </w:rPr>
+        <w:t xml:space="preserve"> de </w:t>
+      </w:r>
+      <w:r>
+        <w:rPr>
+          <w:rFonts w:ascii="Times New Roman" w:hAnsi="Times New Roman" w:cs="Times New Roman"/>
+          <w:color w:val="000000"/>
+          <w:sz w:val="24"/>
+          <w:szCs w:val="24"/>
+          <w:lang w:val="es-ES"/>
+        </w:rPr>
+        <w:t>multiplicar el saldo en dólares por</w:t>
+      </w:r>
+      <w:r>
+        <w:rPr>
+          <w:rFonts w:ascii="Times New Roman" w:hAnsi="Times New Roman" w:cs="Times New Roman"/>
+          <w:color w:val="000000"/>
+          <w:sz w:val="24"/>
+          <w:szCs w:val="24"/>
+          <w:lang w:val="es-ES"/>
+        </w:rPr>
+        <w:t xml:space="preserve"> el</w:t>
+      </w:r>
+      <w:r>
+        <w:rPr>
+          <w:rFonts w:ascii="Times New Roman" w:hAnsi="Times New Roman" w:cs="Times New Roman"/>
+          <w:color w:val="000000"/>
+          <w:sz w:val="24"/>
+          <w:szCs w:val="24"/>
         </w:rPr>
         <w:t xml:space="preserve"> </w:t>
       </w:r>
@@ -226,6 +883,213 @@
           <w:color w:val="000000"/>
           <w:sz w:val="24"/>
           <w:szCs w:val="24"/>
+        </w:rPr>
+        <w:t xml:space="preserve">tipo </w:t>
+      </w:r>
+      <w:r>
+        <w:rPr>
+          <w:rFonts w:ascii="Times New Roman" w:hAnsi="Times New Roman" w:cs="Times New Roman"/>
+          <w:color w:val="000000"/>
+          <w:sz w:val="24"/>
+          <w:szCs w:val="24"/>
+        </w:rPr>
+        <w:t>cambio vendedor del Banco de la Nación Argentina vigente al cierre del día hábil bancario inmediato anterior a la firma del presente</w:t>
+      </w:r>
+      <w:r>
+        <w:rPr>
+          <w:rFonts w:ascii="Times New Roman" w:hAnsi="Times New Roman" w:cs="Times New Roman"/>
+          <w:color w:val="000000"/>
+          <w:sz w:val="24"/>
+          <w:szCs w:val="24"/>
+        </w:rPr>
+        <w:t>,</w:t>
+      </w:r>
+      <w:r>
+        <w:rPr>
+          <w:rFonts w:ascii="Times New Roman" w:hAnsi="Times New Roman" w:cs="Times New Roman"/>
+          <w:color w:val="000000"/>
+          <w:sz w:val="24"/>
+          <w:szCs w:val="24"/>
+        </w:rPr>
+        <w:t xml:space="preserve"> se</w:t>
+      </w:r>
+      <w:proofErr w:type="spellStart"/>
+      <w:r>
+        <w:rPr>
+          <w:rFonts w:ascii="Times New Roman" w:hAnsi="Times New Roman" w:cs="Times New Roman"/>
+          <w:color w:val="000000"/>
+          <w:sz w:val="24"/>
+          <w:szCs w:val="24"/>
+          <w:lang w:val="es-ES"/>
+        </w:rPr>
+        <w:t>rá</w:t>
+      </w:r>
+      <w:proofErr w:type="spellEnd"/>
+      <w:r>
+        <w:rPr>
+          <w:rFonts w:ascii="Times New Roman" w:hAnsi="Times New Roman" w:cs="Times New Roman"/>
+          <w:color w:val="000000"/>
+          <w:sz w:val="24"/>
+          <w:szCs w:val="24"/>
+        </w:rPr>
+        <w:t xml:space="preserve"> abonado por la PARTE COMPRADORA a la PARTE VENDEDORA en {</w:t>
+      </w:r>
+      <w:proofErr w:type="spellStart"/>
+      <w:r>
+        <w:rPr>
+          <w:rFonts w:ascii="Times New Roman" w:hAnsi="Times New Roman" w:cs="Times New Roman"/>
+          <w:color w:val="000000"/>
+          <w:sz w:val="24"/>
+          <w:szCs w:val="24"/>
+        </w:rPr>
+        <w:t>cantidadCuotas</w:t>
+      </w:r>
+      <w:proofErr w:type="spellEnd"/>
+      <w:r>
+        <w:rPr>
+          <w:rFonts w:ascii="Times New Roman" w:hAnsi="Times New Roman" w:cs="Times New Roman"/>
+          <w:color w:val="000000"/>
+          <w:sz w:val="24"/>
+          <w:szCs w:val="24"/>
+        </w:rPr>
+        <w:t>} CUOTAS mensuales</w:t>
+      </w:r>
+      <w:r>
+        <w:rPr>
+          <w:rFonts w:ascii="Times New Roman" w:hAnsi="Times New Roman" w:cs="Times New Roman"/>
+          <w:color w:val="000000"/>
+          <w:sz w:val="24"/>
+          <w:szCs w:val="24"/>
+        </w:rPr>
+        <w:t xml:space="preserve"> </w:t>
+      </w:r>
+      <w:r>
+        <w:rPr>
+          <w:rFonts w:ascii="Times New Roman" w:hAnsi="Times New Roman" w:cs="Times New Roman"/>
+          <w:color w:val="000000"/>
+          <w:sz w:val="24"/>
+          <w:szCs w:val="24"/>
+        </w:rPr>
+        <w:t>y consecutivas</w:t>
+      </w:r>
+      <w:r>
+        <w:rPr>
+          <w:rFonts w:ascii="Times New Roman" w:hAnsi="Times New Roman" w:cs="Times New Roman"/>
+          <w:color w:val="000000"/>
+          <w:sz w:val="24"/>
+          <w:szCs w:val="24"/>
+        </w:rPr>
+        <w:t xml:space="preserve"> de </w:t>
+      </w:r>
+      <w:r>
+        <w:rPr>
+          <w:rFonts w:ascii="Times New Roman" w:hAnsi="Times New Roman" w:cs="Times New Roman"/>
+          <w:color w:val="000000"/>
+          <w:sz w:val="24"/>
+          <w:szCs w:val="24"/>
+          <w:lang w:val="es-ES"/>
+        </w:rPr>
+        <w:t>{</w:t>
+      </w:r>
+      <w:proofErr w:type="spellStart"/>
+      <w:r>
+        <w:rPr>
+          <w:rFonts w:ascii="Times New Roman" w:hAnsi="Times New Roman" w:cs="Times New Roman"/>
+          <w:color w:val="000000"/>
+          <w:sz w:val="24"/>
+          <w:szCs w:val="24"/>
+          <w:lang w:val="es-ES"/>
+        </w:rPr>
+        <w:t>cuotaPesosPalabras</w:t>
+      </w:r>
+      <w:proofErr w:type="spellEnd"/>
+      <w:r>
+        <w:rPr>
+          <w:rFonts w:ascii="Times New Roman" w:hAnsi="Times New Roman" w:cs="Times New Roman"/>
+          <w:color w:val="000000"/>
+          <w:sz w:val="24"/>
+          <w:szCs w:val="24"/>
+          <w:lang w:val="es-ES"/>
+        </w:rPr>
+        <w:t>} (AR$ {</w:t>
+      </w:r>
+      <w:proofErr w:type="spellStart"/>
+      <w:r>
+        <w:rPr>
+          <w:rFonts w:ascii="Times New Roman" w:hAnsi="Times New Roman" w:cs="Times New Roman"/>
+          <w:color w:val="000000"/>
+          <w:sz w:val="24"/>
+          <w:szCs w:val="24"/>
+          <w:lang w:val="es-ES"/>
+        </w:rPr>
+        <w:t>cuotaPesosNum</w:t>
+      </w:r>
+      <w:proofErr w:type="spellEnd"/>
+      <w:r>
+        <w:rPr>
+          <w:rFonts w:ascii="Times New Roman" w:hAnsi="Times New Roman" w:cs="Times New Roman"/>
+          <w:color w:val="000000"/>
+          <w:sz w:val="24"/>
+          <w:szCs w:val="24"/>
+          <w:lang w:val="es-ES"/>
+        </w:rPr>
+        <w:t>})</w:t>
+      </w:r>
+      <w:r>
+        <w:rPr>
+          <w:rFonts w:ascii="Times New Roman" w:hAnsi="Times New Roman" w:cs="Times New Roman"/>
+          <w:color w:val="000000"/>
+          <w:sz w:val="24"/>
+          <w:szCs w:val="24"/>
+        </w:rPr>
+        <w:t>,</w:t>
+      </w:r>
+      <w:r>
+        <w:rPr>
+          <w:rFonts w:ascii="Times New Roman" w:hAnsi="Times New Roman" w:cs="Times New Roman"/>
+          <w:color w:val="000000"/>
+          <w:sz w:val="24"/>
+          <w:szCs w:val="24"/>
+        </w:rPr>
+        <w:t xml:space="preserve"> que serán ajustadas mensualmente con el índice de la Cámara Argentina de la Construcción (CAC), venciendo la primera entre el d</w:t>
+      </w:r>
+      <w:proofErr w:type="spellStart"/>
+      <w:r>
+        <w:rPr>
+          <w:rFonts w:ascii="Times New Roman" w:hAnsi="Times New Roman" w:cs="Times New Roman"/>
+          <w:color w:val="000000"/>
+          <w:sz w:val="24"/>
+          <w:szCs w:val="24"/>
+          <w:lang w:val="es-ES"/>
+        </w:rPr>
+        <w:t>ía</w:t>
+      </w:r>
+      <w:proofErr w:type="spellEnd"/>
+      <w:r>
+        <w:rPr>
+          <w:rFonts w:ascii="Times New Roman" w:hAnsi="Times New Roman" w:cs="Times New Roman"/>
+          <w:color w:val="000000"/>
+          <w:sz w:val="24"/>
+          <w:szCs w:val="24"/>
+          <w:lang w:val="es-ES"/>
+        </w:rPr>
+        <w:t xml:space="preserve"> 1 y 10 del mes siguiente a la fecha de la firma del presente documento; tomándose como base de cálculo el último índice CAC publicado al día de la fecha.</w:t>
+      </w:r>
+      <w:r>
+        <w:rPr>
+          <w:rFonts w:ascii="Times New Roman" w:hAnsi="Times New Roman" w:cs="Times New Roman"/>
+          <w:color w:val="000000"/>
+          <w:sz w:val="24"/>
+          <w:szCs w:val="24"/>
+        </w:rPr>
+        <w:t xml:space="preserve"> </w:t>
+      </w:r>
+      <w:r>
+        <w:rPr>
+          <w:rFonts w:ascii="Times New Roman" w:hAnsi="Times New Roman" w:cs="Times New Roman"/>
+          <w:color w:val="000000"/>
+          <w:sz w:val="24"/>
+          <w:szCs w:val="24"/>
           <w:lang w:val="es-ES_tradnl"/>
         </w:rPr>
         <w:t>Al momento de realizar el último pago y saldar totalmente la deuda contraída, se celebrará la escritura</w:t>
@@ -258,8 +1122,31 @@
           <w:szCs w:val="24"/>
           <w:lang w:val="es-ES_tradnl"/>
         </w:rPr>
-        <w:t xml:space="preserve"> dentro del radio de la Ciudad Autónoma de Buenos Aires.- Ambas partes manifiestan que otorgan plena validez al pago que se efectúan mediante el presente y expresan que no tienen reclamo que formularse y renuncian a invocar las acciones establecidas en los artículos 1083 a 1088 del Código Civil y Comercial de la Nación respecto al pacto comisorio, como así también renuncian a cualquier acción que les pudiera corresponder por incumplimiento de la ley 25.345. Las partes renuncian a la facultad de arrepentimiento prevista por el artículo 1059 del mencionado Código.-</w:t>
-      </w:r>
+        <w:t xml:space="preserve"> dentro del radio de la Ciudad Autónoma de Buenos Aires.- Ambas partes manifiestan que otorgan plena validez al pago que se efectúan mediante el presente y expresan que no </w:t>
+      </w:r>
+      <w:r>
+        <w:rPr>
+          <w:rFonts w:ascii="Times New Roman" w:hAnsi="Times New Roman" w:cs="Times New Roman"/>
+          <w:color w:val="000000"/>
+          <w:sz w:val="24"/>
+          <w:szCs w:val="24"/>
+          <w:lang w:val="es-ES_tradnl"/>
+        </w:rPr>
+        <w:lastRenderedPageBreak/>
+        <w:t xml:space="preserve">tienen reclamo que formularse y renuncian a invocar las acciones establecidas en los artículos 1083 a 1088 del Código Civil y Comercial de la Nación respecto al pacto comisorio, como así también renuncian a cualquier acción que les pudiera corresponder por incumplimiento de la ley 25.345. Las partes renuncian a la facultad de arrepentimiento prevista por el artículo 1059 del mencionado </w:t>
+      </w:r>
+      <w:proofErr w:type="gramStart"/>
+      <w:r>
+        <w:rPr>
+          <w:rFonts w:ascii="Times New Roman" w:hAnsi="Times New Roman" w:cs="Times New Roman"/>
+          <w:color w:val="000000"/>
+          <w:sz w:val="24"/>
+          <w:szCs w:val="24"/>
+          <w:lang w:val="es-ES_tradnl"/>
+        </w:rPr>
+        <w:t>Código.-</w:t>
+      </w:r>
+      <w:proofErr w:type="gramEnd"/>
       <w:r>
         <w:rPr>
           <w:rFonts w:ascii="Times New Roman" w:hAnsi="Times New Roman" w:cs="Times New Roman"/>
@@ -298,7 +1185,6 @@
           <w:u w:val="single"/>
           <w:lang w:val="es-ES_tradnl"/>
         </w:rPr>
-        <w:lastRenderedPageBreak/>
         <w:t>CUARTA:</w:t>
       </w:r>
       <w:r>
@@ -321,7 +1207,29 @@
           <w:szCs w:val="24"/>
           <w:lang w:val="es-ES_tradnl"/>
         </w:rPr>
-        <w:t xml:space="preserve">Las partes acuerdan que el precio se ha convenido en dólares estadounidenses billetes, como moneda de contrato, en los términos del artículo 766 del Código Civil y Comercial de la Nación. Ambas partes renuncian a lo estatuido en el artículo 765 del mismo ordenamiento legal, de acuerdo a lo establecido en el artículo 13 ya que los efectos de la ley pueden ser renunciados en el caso particular por no estar prohibido por el ordenamiento jurídico. Por tratarse de una obligación de género se establece que la elección queda en cabeza de </w:t>
+        <w:t xml:space="preserve">Las partes acuerdan que el precio se ha convenido en dólares estadounidenses billetes, como moneda de contrato, en los términos del artículo 766 del Código Civil y Comercial de la Nación. Ambas partes renuncian a lo estatuido en el artículo 765 del mismo ordenamiento legal, </w:t>
+      </w:r>
+      <w:proofErr w:type="gramStart"/>
+      <w:r>
+        <w:rPr>
+          <w:rFonts w:ascii="Times New Roman" w:hAnsi="Times New Roman" w:cs="Times New Roman"/>
+          <w:color w:val="000000"/>
+          <w:sz w:val="24"/>
+          <w:szCs w:val="24"/>
+          <w:lang w:val="es-ES_tradnl"/>
+        </w:rPr>
+        <w:t>de acuerdo a</w:t>
+      </w:r>
+      <w:proofErr w:type="gramEnd"/>
+      <w:r>
+        <w:rPr>
+          <w:rFonts w:ascii="Times New Roman" w:hAnsi="Times New Roman" w:cs="Times New Roman"/>
+          <w:color w:val="000000"/>
+          <w:sz w:val="24"/>
+          <w:szCs w:val="24"/>
+          <w:lang w:val="es-ES_tradnl"/>
+        </w:rPr>
+        <w:t xml:space="preserve"> lo establecido en el artículo 13 ya que los efectos de la ley pueden ser renunciados en el caso particular por no estar prohibido por el ordenamiento jurídico. Por tratarse de una obligación de género se establece que la elección queda en cabeza de </w:t>
       </w:r>
       <w:r>
         <w:rPr>
@@ -540,6 +1448,7 @@
           <w:szCs w:val="24"/>
           <w:lang w:val="es-ES_tradnl"/>
         </w:rPr>
+        <w:lastRenderedPageBreak/>
         <w:t>PARTE VENDEDORA</w:t>
       </w:r>
       <w:r>
@@ -570,18 +1479,95 @@
           <w:szCs w:val="24"/>
           <w:lang w:val="es-ES_tradnl"/>
         </w:rPr>
-        <w:t xml:space="preserve">pago de la cuota N° {numeroCuotaEntrega}, libre de efectos y/u ocupantes y sin oposición de terceros; recibiéndola ésta última de conformidad.-{/entregaCuota}{#entregaAlSaldo}La posesión será entregada por la PARTE </w:t>
-      </w:r>
-      <w:r>
-        <w:rPr>
-          <w:rFonts w:ascii="Times New Roman" w:hAnsi="Times New Roman" w:cs="Times New Roman"/>
-          <w:color w:val="000000"/>
-          <w:sz w:val="24"/>
-          <w:szCs w:val="24"/>
-          <w:lang w:val="es-ES_tradnl"/>
-        </w:rPr>
-        <w:lastRenderedPageBreak/>
-        <w:t xml:space="preserve">VENDEDORA a la PARTE COMPRADORA en oportunidad de suscribirse la escritura traslativa de dominio, libre de efectos y/u ocupantes y sin oposición de terceros; recibiéndola ésta última de conformidad.-{/entregaAlSaldo} </w:t>
+        <w:t xml:space="preserve">pago de la cuota </w:t>
+      </w:r>
+      <w:proofErr w:type="spellStart"/>
+      <w:r>
+        <w:rPr>
+          <w:rFonts w:ascii="Times New Roman" w:hAnsi="Times New Roman" w:cs="Times New Roman"/>
+          <w:color w:val="000000"/>
+          <w:sz w:val="24"/>
+          <w:szCs w:val="24"/>
+          <w:lang w:val="es-ES_tradnl"/>
+        </w:rPr>
+        <w:t>N°</w:t>
+      </w:r>
+      <w:proofErr w:type="spellEnd"/>
+      <w:r>
+        <w:rPr>
+          <w:rFonts w:ascii="Times New Roman" w:hAnsi="Times New Roman" w:cs="Times New Roman"/>
+          <w:color w:val="000000"/>
+          <w:sz w:val="24"/>
+          <w:szCs w:val="24"/>
+          <w:lang w:val="es-ES_tradnl"/>
+        </w:rPr>
+        <w:t xml:space="preserve"> {</w:t>
+      </w:r>
+      <w:proofErr w:type="spellStart"/>
+      <w:r>
+        <w:rPr>
+          <w:rFonts w:ascii="Times New Roman" w:hAnsi="Times New Roman" w:cs="Times New Roman"/>
+          <w:color w:val="000000"/>
+          <w:sz w:val="24"/>
+          <w:szCs w:val="24"/>
+          <w:lang w:val="es-ES_tradnl"/>
+        </w:rPr>
+        <w:t>numeroCuotaEntrega</w:t>
+      </w:r>
+      <w:proofErr w:type="spellEnd"/>
+      <w:r>
+        <w:rPr>
+          <w:rFonts w:ascii="Times New Roman" w:hAnsi="Times New Roman" w:cs="Times New Roman"/>
+          <w:color w:val="000000"/>
+          <w:sz w:val="24"/>
+          <w:szCs w:val="24"/>
+          <w:lang w:val="es-ES_tradnl"/>
+        </w:rPr>
+        <w:t>}, libre de efectos y/u ocupantes y sin oposición de terceros; recibiéndola ésta última de conformidad.-{/</w:t>
+      </w:r>
+      <w:proofErr w:type="spellStart"/>
+      <w:r>
+        <w:rPr>
+          <w:rFonts w:ascii="Times New Roman" w:hAnsi="Times New Roman" w:cs="Times New Roman"/>
+          <w:color w:val="000000"/>
+          <w:sz w:val="24"/>
+          <w:szCs w:val="24"/>
+          <w:lang w:val="es-ES_tradnl"/>
+        </w:rPr>
+        <w:t>entregaCuota</w:t>
+      </w:r>
+      <w:proofErr w:type="spellEnd"/>
+      <w:r>
+        <w:rPr>
+          <w:rFonts w:ascii="Times New Roman" w:hAnsi="Times New Roman" w:cs="Times New Roman"/>
+          <w:color w:val="000000"/>
+          <w:sz w:val="24"/>
+          <w:szCs w:val="24"/>
+          <w:lang w:val="es-ES_tradnl"/>
+        </w:rPr>
+        <w:t>}{#entregaAlSaldo}La posesión será entregada por la PARTE VENDEDORA a la PARTE COMPRADORA en oportunidad de suscribirse la escritura traslativa de dominio, libre de efectos y/u ocupantes y sin oposición de terceros; recibiéndola ésta última de conformidad.-{/</w:t>
+      </w:r>
+      <w:proofErr w:type="spellStart"/>
+      <w:r>
+        <w:rPr>
+          <w:rFonts w:ascii="Times New Roman" w:hAnsi="Times New Roman" w:cs="Times New Roman"/>
+          <w:color w:val="000000"/>
+          <w:sz w:val="24"/>
+          <w:szCs w:val="24"/>
+          <w:lang w:val="es-ES_tradnl"/>
+        </w:rPr>
+        <w:t>entregaAlSaldo</w:t>
+      </w:r>
+      <w:proofErr w:type="spellEnd"/>
+      <w:r>
+        <w:rPr>
+          <w:rFonts w:ascii="Times New Roman" w:hAnsi="Times New Roman" w:cs="Times New Roman"/>
+          <w:color w:val="000000"/>
+          <w:sz w:val="24"/>
+          <w:szCs w:val="24"/>
+          <w:lang w:val="es-ES_tradnl"/>
+        </w:rPr>
+        <w:t xml:space="preserve">} </w:t>
       </w:r>
     </w:p>
     <w:p>
@@ -640,7 +1626,51 @@
           <w:szCs w:val="24"/>
           <w:lang w:val="es-ES_tradnl"/>
         </w:rPr>
-        <w:t xml:space="preserve">, por ante el Escribano Sebastián Ezequiel Nadela, con oficinas en la calle Hipólito Yrigoyen 850, piso 3, oficina 332, de esta Ciudad, Titular del Registro Notarial Nº 1453, teléfonos 4334-1482, email sebastian@escribanianadela.com.ar / ap@escribanianadela.com.ar a quien las partes facultan para hacer las citaciones y emplazamientos de Acto Notarial. La fecha máxima de escrituración prevista podrá prorrogarse en caso que el trámite a realizar en el expediente sucesorio sufriera demoras por causas ajenas a la diligencia de la parte vendedora. Las partes asimismo se obligan a hacer entrega de la documentación correspondiente, como ser títulos originales. El pago de tasas, De corresponder, el impuesto a las ganancias, sellados, impuestos y demás erogaciones emergentes de la escritura traslativa de dominio serán soportados en su totalidad por la PARTE COMPRADORA, incluyendo el pago del impuesto de sellos que pudiera corresponder. </w:t>
+        <w:t xml:space="preserve">, por ante el Escribano Sebastián Ezequiel Nadela, con oficinas en la calle Hipólito Yrigoyen 850, piso 3, oficina 332, de esta Ciudad, Titular del Registro Notarial </w:t>
+      </w:r>
+      <w:proofErr w:type="spellStart"/>
+      <w:r>
+        <w:rPr>
+          <w:rFonts w:ascii="Times New Roman" w:hAnsi="Times New Roman" w:cs="Times New Roman"/>
+          <w:color w:val="000000"/>
+          <w:sz w:val="24"/>
+          <w:szCs w:val="24"/>
+          <w:lang w:val="es-ES_tradnl"/>
+        </w:rPr>
+        <w:t>Nº</w:t>
+      </w:r>
+      <w:proofErr w:type="spellEnd"/>
+      <w:r>
+        <w:rPr>
+          <w:rFonts w:ascii="Times New Roman" w:hAnsi="Times New Roman" w:cs="Times New Roman"/>
+          <w:color w:val="000000"/>
+          <w:sz w:val="24"/>
+          <w:szCs w:val="24"/>
+          <w:lang w:val="es-ES_tradnl"/>
+        </w:rPr>
+        <w:t xml:space="preserve"> 1453, teléfonos 4334-1482, email sebastian@escribanianadela.com.ar / ap@escribanianadela.com.ar a quien las partes facultan para hacer las citaciones y emplazamientos de Acto Notarial. La fecha máxima de escrituración prevista podrá prorrogarse </w:t>
+      </w:r>
+      <w:proofErr w:type="gramStart"/>
+      <w:r>
+        <w:rPr>
+          <w:rFonts w:ascii="Times New Roman" w:hAnsi="Times New Roman" w:cs="Times New Roman"/>
+          <w:color w:val="000000"/>
+          <w:sz w:val="24"/>
+          <w:szCs w:val="24"/>
+          <w:lang w:val="es-ES_tradnl"/>
+        </w:rPr>
+        <w:t>en caso que</w:t>
+      </w:r>
+      <w:proofErr w:type="gramEnd"/>
+      <w:r>
+        <w:rPr>
+          <w:rFonts w:ascii="Times New Roman" w:hAnsi="Times New Roman" w:cs="Times New Roman"/>
+          <w:color w:val="000000"/>
+          <w:sz w:val="24"/>
+          <w:szCs w:val="24"/>
+          <w:lang w:val="es-ES_tradnl"/>
+        </w:rPr>
+        <w:t xml:space="preserve"> el trámite a realizar en el expediente sucesorio sufriera demoras por causas ajenas a la diligencia de la parte vendedora. Las partes asimismo se obligan a hacer entrega de la documentación correspondiente, como ser títulos originales. El pago de tasas, De corresponder, el impuesto a las ganancias, sellados, impuestos y demás erogaciones emergentes de la escritura traslativa de dominio serán soportados en su totalidad por la PARTE COMPRADORA, incluyendo el pago del impuesto de sellos que pudiera corresponder. </w:t>
       </w:r>
     </w:p>
     <w:p>
@@ -757,7 +1787,17 @@
           <w:szCs w:val="24"/>
           <w:lang w:val="es-ES_tradnl"/>
         </w:rPr>
-        <w:t xml:space="preserve"> podrá optar por: A) Exigir su total cumplimiento más el pago de una multa diaria de Dólares Estadounidenses Billetes doscientos (U$S 200), sea día hábil o inhábil, en concepto de cláusula penal, la que se devengará automáticamente, sin necesidad de interpelación judicial o extrajudicial alguna, hasta el efectivo cumplimiento de </w:t>
+        <w:t xml:space="preserve"> podrá optar por: A) Exigir su total cumplimiento más el pago de una multa diaria de Dólares Estadounidenses Billetes doscientos (U$S 200), sea día hábil o inhábil, en concepto </w:t>
+      </w:r>
+      <w:r>
+        <w:rPr>
+          <w:rFonts w:ascii="Times New Roman" w:hAnsi="Times New Roman" w:cs="Times New Roman"/>
+          <w:sz w:val="24"/>
+          <w:szCs w:val="24"/>
+          <w:lang w:val="es-ES_tradnl"/>
+        </w:rPr>
+        <w:lastRenderedPageBreak/>
+        <w:t xml:space="preserve">de cláusula penal, la que se devengará automáticamente, sin necesidad de interpelación judicial o extrajudicial alguna, hasta el efectivo cumplimiento de </w:t>
       </w:r>
       <w:r>
         <w:rPr>
@@ -806,19 +1846,7 @@
           <w:szCs w:val="24"/>
           <w:lang w:val="es-ES_tradnl"/>
         </w:rPr>
-        <w:t xml:space="preserve">PARTE </w:t>
-      </w:r>
-      <w:r>
-        <w:rPr>
-          <w:rFonts w:ascii="Times New Roman" w:hAnsi="Times New Roman" w:cs="Times New Roman"/>
-          <w:b/>
-          <w:bCs/>
-          <w:sz w:val="24"/>
-          <w:szCs w:val="24"/>
-          <w:lang w:val="es-ES_tradnl"/>
-        </w:rPr>
-        <w:lastRenderedPageBreak/>
-        <w:t>COMPRADORA</w:t>
+        <w:t>PARTE COMPRADORA</w:t>
       </w:r>
       <w:r>
         <w:rPr>
@@ -1075,7 +2103,27 @@
           <w:szCs w:val="24"/>
           <w:lang w:val="es-ES_tradnl"/>
         </w:rPr>
-        <w:t xml:space="preserve"> la suma recibida en este acto, con más otra suma igual en concepto de indemnización, dentro de las 48 horas de producida la mora, sin necesidad de interpelación judicial o extrajudicial, con facultad para iniciar las acciones que correspondan. En este último caso será aplicable lo establecido por el artículo tercero del presente boleto, en lo que se refiere al pago en dólares estadounidenses. Para todos los efectos de este Boleto de compraventa, las partes acuerdan que la mora se producirá de pleno derecho previa intimación fehaciente al cumplimiento por 10 días, mediante carta documento.-  </w:t>
+        <w:t xml:space="preserve"> la suma recibida en este acto, con más otra suma igual en concepto de indemnización, dentro de las 48 horas de producida la mora, sin necesidad de interpelación judicial o extrajudicial, con facultad para iniciar las acciones que correspondan. En este último caso será aplicable lo establecido por el artículo tercero del presente boleto, en lo que se refiere al pago en dólares estadounidenses. Para todos los efectos de este Boleto de compraventa, las partes acuerdan que la mora se producirá de pleno derecho previa intimación fehaciente al cumplimiento por 10 días, mediante carta </w:t>
+      </w:r>
+      <w:proofErr w:type="gramStart"/>
+      <w:r>
+        <w:rPr>
+          <w:rFonts w:ascii="Times New Roman" w:hAnsi="Times New Roman" w:cs="Times New Roman"/>
+          <w:sz w:val="24"/>
+          <w:szCs w:val="24"/>
+          <w:lang w:val="es-ES_tradnl"/>
+        </w:rPr>
+        <w:t>documento.-</w:t>
+      </w:r>
+      <w:proofErr w:type="gramEnd"/>
+      <w:r>
+        <w:rPr>
+          <w:rFonts w:ascii="Times New Roman" w:hAnsi="Times New Roman" w:cs="Times New Roman"/>
+          <w:sz w:val="24"/>
+          <w:szCs w:val="24"/>
+          <w:lang w:val="es-ES_tradnl"/>
+        </w:rPr>
+        <w:t xml:space="preserve">  </w:t>
       </w:r>
     </w:p>
     <w:p>
@@ -1102,6 +2150,7 @@
           <w:u w:val="single"/>
           <w:lang w:val="es-ES_tradnl"/>
         </w:rPr>
+        <w:lastRenderedPageBreak/>
         <w:t>OCTAVA</w:t>
       </w:r>
       <w:r>
@@ -1160,17 +2209,47 @@
           <w:szCs w:val="24"/>
           <w:lang w:val="es-ES_tradnl"/>
         </w:rPr>
-        <w:t xml:space="preserve">sus herederos deberán unificar su representación dentro de los treinta (30) días del fallecimiento, ratificando el domicilio constituido o constituyendo uno nuevo, siempre dentro de esta Ciudad Autónoma de Buenos Aires, y dar cumplimiento a todas y cada una de las cláusulas y condiciones establecidas en EL BOLETO. Idéntico procedimiento </w:t>
-      </w:r>
-      <w:r>
-        <w:rPr>
-          <w:rFonts w:ascii="Times New Roman" w:hAnsi="Times New Roman" w:cs="Times New Roman"/>
-          <w:sz w:val="24"/>
-          <w:szCs w:val="24"/>
-          <w:lang w:val="es-ES_tradnl"/>
-        </w:rPr>
-        <w:lastRenderedPageBreak/>
-        <w:t xml:space="preserve">deberá asumir en caso de incapacidad de las partes. Asimismo, se obligan a hacerlo saber a la otra parte. Si en el plazo estipulado no se unificara la representación o si posteriormente no se cumpliera con algunas de las obligaciones establecidas en el BOLETO, la parte cumplidora podrá exigirle a la parte obrar de acuerdo a lo establecido en la cláusula séptima.- </w:t>
+        <w:t xml:space="preserve">sus herederos deberán unificar su representación dentro de los treinta (30) días del fallecimiento, ratificando el domicilio constituido o constituyendo uno nuevo, siempre dentro de esta Ciudad Autónoma de Buenos Aires, y dar cumplimiento a todas y cada una de las cláusulas y condiciones establecidas en EL BOLETO. Idéntico procedimiento deberá asumir en caso de incapacidad de las partes. Asimismo, se obligan a hacerlo saber a la otra parte. Si en el plazo estipulado no se unificara la representación o si posteriormente no se cumpliera con algunas de las obligaciones establecidas en el BOLETO, la parte cumplidora podrá exigirle a la parte obrar </w:t>
+      </w:r>
+      <w:proofErr w:type="gramStart"/>
+      <w:r>
+        <w:rPr>
+          <w:rFonts w:ascii="Times New Roman" w:hAnsi="Times New Roman" w:cs="Times New Roman"/>
+          <w:sz w:val="24"/>
+          <w:szCs w:val="24"/>
+          <w:lang w:val="es-ES_tradnl"/>
+        </w:rPr>
+        <w:t>de acuerdo a</w:t>
+      </w:r>
+      <w:proofErr w:type="gramEnd"/>
+      <w:r>
+        <w:rPr>
+          <w:rFonts w:ascii="Times New Roman" w:hAnsi="Times New Roman" w:cs="Times New Roman"/>
+          <w:sz w:val="24"/>
+          <w:szCs w:val="24"/>
+          <w:lang w:val="es-ES_tradnl"/>
+        </w:rPr>
+        <w:t xml:space="preserve"> lo establecido en la cláusula </w:t>
+      </w:r>
+      <w:proofErr w:type="gramStart"/>
+      <w:r>
+        <w:rPr>
+          <w:rFonts w:ascii="Times New Roman" w:hAnsi="Times New Roman" w:cs="Times New Roman"/>
+          <w:sz w:val="24"/>
+          <w:szCs w:val="24"/>
+          <w:lang w:val="es-ES_tradnl"/>
+        </w:rPr>
+        <w:t>séptima.-</w:t>
+      </w:r>
+      <w:proofErr w:type="gramEnd"/>
+      <w:r>
+        <w:rPr>
+          <w:rFonts w:ascii="Times New Roman" w:hAnsi="Times New Roman" w:cs="Times New Roman"/>
+          <w:sz w:val="24"/>
+          <w:szCs w:val="24"/>
+          <w:lang w:val="es-ES_tradnl"/>
+        </w:rPr>
+        <w:t xml:space="preserve"> </w:t>
       </w:r>
     </w:p>
     <w:p>
@@ -1272,8 +2351,20 @@
           <w:szCs w:val="24"/>
           <w:lang w:val="es-ES_tradnl"/>
         </w:rPr>
-        <w:t xml:space="preserve"> deberá prestar conformidad expresa con dicha cesión, sin la cual la misma no tendrá validez alguna.-</w:t>
-      </w:r>
+        <w:t xml:space="preserve"> deberá prestar conformidad expresa con dicha cesión, sin la cual la misma no tendrá validez </w:t>
+      </w:r>
+      <w:proofErr w:type="gramStart"/>
+      <w:r>
+        <w:rPr>
+          <w:rFonts w:ascii="Times New Roman" w:hAnsi="Times New Roman" w:cs="Times New Roman"/>
+          <w:color w:val="000000" w:themeColor="text1"/>
+          <w:sz w:val="24"/>
+          <w:szCs w:val="24"/>
+          <w:lang w:val="es-ES_tradnl"/>
+        </w:rPr>
+        <w:t>alguna.-</w:t>
+      </w:r>
+      <w:proofErr w:type="gramEnd"/>
     </w:p>
     <w:p>
       <w:pPr>
@@ -1296,7 +2387,27 @@
           <w:szCs w:val="24"/>
           <w:lang w:val="es-ES_tradnl"/>
         </w:rPr>
-        <w:t xml:space="preserve">Las partes se someten a los Tribunales en lo Civil de la Justicia Ordinaria de la Capital Federal, Ciudad Autónoma de Buenos Aires, renunciando a todo otro fuero o jurisdicción que pudiera corresponder, constituyendo domicilio especial en los indicados al comienzo de la presente, donde serán válidas todas las notificaciones, citaciones y emplazamientos que fueren menester realizar.- </w:t>
+        <w:t xml:space="preserve">Las partes se someten a los Tribunales en lo Civil de la Justicia Ordinaria de la Capital Federal, Ciudad Autónoma de Buenos Aires, renunciando a todo otro fuero o jurisdicción que pudiera corresponder, constituyendo domicilio especial en los indicados al comienzo de la presente, donde serán válidas todas las notificaciones, citaciones y emplazamientos que fueren menester </w:t>
+      </w:r>
+      <w:proofErr w:type="gramStart"/>
+      <w:r>
+        <w:rPr>
+          <w:rFonts w:ascii="Times New Roman" w:hAnsi="Times New Roman" w:cs="Times New Roman"/>
+          <w:sz w:val="24"/>
+          <w:szCs w:val="24"/>
+          <w:lang w:val="es-ES_tradnl"/>
+        </w:rPr>
+        <w:t>realizar.-</w:t>
+      </w:r>
+      <w:proofErr w:type="gramEnd"/>
+      <w:r>
+        <w:rPr>
+          <w:rFonts w:ascii="Times New Roman" w:hAnsi="Times New Roman" w:cs="Times New Roman"/>
+          <w:sz w:val="24"/>
+          <w:szCs w:val="24"/>
+          <w:lang w:val="es-ES_tradnl"/>
+        </w:rPr>
+        <w:t xml:space="preserve"> </w:t>
       </w:r>
     </w:p>
     <w:p>
@@ -1338,7 +2449,27 @@
           <w:szCs w:val="24"/>
           <w:lang w:val="es-ES_tradnl"/>
         </w:rPr>
-        <w:t xml:space="preserve">(2) ejemplares de un mismo tenor; uno para la parte adquirente, uno para la parte vendedora en el lugar y fecha arriba indicado.- </w:t>
+        <w:t xml:space="preserve">(2) ejemplares de un mismo tenor; uno para la parte adquirente, uno para la parte vendedora en el lugar y fecha arriba </w:t>
+      </w:r>
+      <w:proofErr w:type="gramStart"/>
+      <w:r>
+        <w:rPr>
+          <w:rFonts w:ascii="Times New Roman" w:hAnsi="Times New Roman" w:cs="Times New Roman"/>
+          <w:sz w:val="24"/>
+          <w:szCs w:val="24"/>
+          <w:lang w:val="es-ES_tradnl"/>
+        </w:rPr>
+        <w:t>indicado.-</w:t>
+      </w:r>
+      <w:proofErr w:type="gramEnd"/>
+      <w:r>
+        <w:rPr>
+          <w:rFonts w:ascii="Times New Roman" w:hAnsi="Times New Roman" w:cs="Times New Roman"/>
+          <w:sz w:val="24"/>
+          <w:szCs w:val="24"/>
+          <w:lang w:val="es-ES_tradnl"/>
+        </w:rPr>
+        <w:t xml:space="preserve"> </w:t>
       </w:r>
     </w:p>
     <w:p>
@@ -1823,7 +2954,6 @@
   <w:style w:type="character" w:default="1" w:styleId="DefaultParagraphFont">
     <w:name w:val="Default Paragraph Font"/>
     <w:uiPriority w:val="1"/>
-    <w:semiHidden/>
     <w:unhideWhenUsed/>
   </w:style>
   <w:style w:type="table" w:default="1" w:styleId="TableNormal">
@@ -1869,6 +2999,16 @@
       <w:color w:val="605E5C"/>
       <w:shd w:val="clear" w:color="auto" w:fill="E1DFDD"/>
     </w:rPr>
+  </w:style>
+  <w:style w:type="paragraph" w:styleId="Revision">
+    <w:name w:val="Revision"/>
+    <w:hidden/>
+    <w:uiPriority w:val="99"/>
+    <w:semiHidden/>
+    <w:rsid w:val="004E6621"/>
+    <w:pPr>
+      <w:spacing w:after="0" w:line="240" w:lineRule="auto"/>
+    </w:pPr>
   </w:style>
 </w:styles>
 </file>

</xml_diff>

<commit_message>
Update boleto financing template
</commit_message>
<xml_diff>
--- a/src/templates/boleto-template-cuotas.docx
+++ b/src/templates/boleto-template-cuotas.docx
@@ -413,29 +413,7 @@
           <w:szCs w:val="24"/>
           <w:lang w:val="es-ES_tradnl"/>
         </w:rPr>
-        <w:t xml:space="preserve">}, pasada ante el Escribano de </w:t>
-      </w:r>
-      <w:proofErr w:type="gramStart"/>
-      <w:r>
-        <w:rPr>
-          <w:rFonts w:ascii="Times New Roman" w:hAnsi="Times New Roman" w:cs="Times New Roman"/>
-          <w:color w:val="000000"/>
-          <w:sz w:val="24"/>
-          <w:szCs w:val="24"/>
-          <w:lang w:val="es-ES_tradnl"/>
-        </w:rPr>
-        <w:t>ésta</w:t>
-      </w:r>
-      <w:proofErr w:type="gramEnd"/>
-      <w:r>
-        <w:rPr>
-          <w:rFonts w:ascii="Times New Roman" w:hAnsi="Times New Roman" w:cs="Times New Roman"/>
-          <w:color w:val="000000"/>
-          <w:sz w:val="24"/>
-          <w:szCs w:val="24"/>
-          <w:lang w:val="es-ES_tradnl"/>
-        </w:rPr>
-        <w:t xml:space="preserve"> Ciudad, Sebastián E. Nadela, al folio {folio} del Registro 1.453 a su cargo, cuya Primera Copia se inscribió en el Registro de la Propiedad Inmueble de la Provincia de Buenos Aires, con fecha {</w:t>
+        <w:t>}, pasada ante el Escribano de ésta Ciudad, Sebastián E. Nadela, al folio {folio} del Registro 1.453 a su cargo, cuya Primera Copia se inscribió en el Registro de la Propiedad Inmueble de la Provincia de Buenos Aires, con fecha {</w:t>
       </w:r>
       <w:proofErr w:type="spellStart"/>
       <w:r>
@@ -1133,20 +1111,8 @@
           <w:lang w:val="es-ES_tradnl"/>
         </w:rPr>
         <w:lastRenderedPageBreak/>
-        <w:t xml:space="preserve">tienen reclamo que formularse y renuncian a invocar las acciones establecidas en los artículos 1083 a 1088 del Código Civil y Comercial de la Nación respecto al pacto comisorio, como así también renuncian a cualquier acción que les pudiera corresponder por incumplimiento de la ley 25.345. Las partes renuncian a la facultad de arrepentimiento prevista por el artículo 1059 del mencionado </w:t>
-      </w:r>
-      <w:proofErr w:type="gramStart"/>
-      <w:r>
-        <w:rPr>
-          <w:rFonts w:ascii="Times New Roman" w:hAnsi="Times New Roman" w:cs="Times New Roman"/>
-          <w:color w:val="000000"/>
-          <w:sz w:val="24"/>
-          <w:szCs w:val="24"/>
-          <w:lang w:val="es-ES_tradnl"/>
-        </w:rPr>
-        <w:t>Código.-</w:t>
-      </w:r>
-      <w:proofErr w:type="gramEnd"/>
+        <w:t>tienen reclamo que formularse y renuncian a invocar las acciones establecidas en los artículos 1083 a 1088 del Código Civil y Comercial de la Nación respecto al pacto comisorio, como así también renuncian a cualquier acción que les pudiera corresponder por incumplimiento de la ley 25.345. Las partes renuncian a la facultad de arrepentimiento prevista por el artículo 1059 del mencionado Código.-</w:t>
+      </w:r>
       <w:r>
         <w:rPr>
           <w:rFonts w:ascii="Times New Roman" w:hAnsi="Times New Roman" w:cs="Times New Roman"/>
@@ -1207,29 +1173,7 @@
           <w:szCs w:val="24"/>
           <w:lang w:val="es-ES_tradnl"/>
         </w:rPr>
-        <w:t xml:space="preserve">Las partes acuerdan que el precio se ha convenido en dólares estadounidenses billetes, como moneda de contrato, en los términos del artículo 766 del Código Civil y Comercial de la Nación. Ambas partes renuncian a lo estatuido en el artículo 765 del mismo ordenamiento legal, </w:t>
-      </w:r>
-      <w:proofErr w:type="gramStart"/>
-      <w:r>
-        <w:rPr>
-          <w:rFonts w:ascii="Times New Roman" w:hAnsi="Times New Roman" w:cs="Times New Roman"/>
-          <w:color w:val="000000"/>
-          <w:sz w:val="24"/>
-          <w:szCs w:val="24"/>
-          <w:lang w:val="es-ES_tradnl"/>
-        </w:rPr>
-        <w:t>de acuerdo a</w:t>
-      </w:r>
-      <w:proofErr w:type="gramEnd"/>
-      <w:r>
-        <w:rPr>
-          <w:rFonts w:ascii="Times New Roman" w:hAnsi="Times New Roman" w:cs="Times New Roman"/>
-          <w:color w:val="000000"/>
-          <w:sz w:val="24"/>
-          <w:szCs w:val="24"/>
-          <w:lang w:val="es-ES_tradnl"/>
-        </w:rPr>
-        <w:t xml:space="preserve"> lo establecido en el artículo 13 ya que los efectos de la ley pueden ser renunciados en el caso particular por no estar prohibido por el ordenamiento jurídico. Por tratarse de una obligación de género se establece que la elección queda en cabeza de </w:t>
+        <w:t xml:space="preserve">Las partes acuerdan que el precio se ha convenido en dólares estadounidenses billetes, como moneda de contrato, en los términos del artículo 766 del Código Civil y Comercial de la Nación. Ambas partes renuncian a lo estatuido en el artículo 765 del mismo ordenamiento legal, de acuerdo a lo establecido en el artículo 13 ya que los efectos de la ley pueden ser renunciados en el caso particular por no estar prohibido por el ordenamiento jurídico. Por tratarse de una obligación de género se establece que la elección queda en cabeza de </w:t>
       </w:r>
       <w:r>
         <w:rPr>
@@ -1648,29 +1592,7 @@
           <w:szCs w:val="24"/>
           <w:lang w:val="es-ES_tradnl"/>
         </w:rPr>
-        <w:t xml:space="preserve"> 1453, teléfonos 4334-1482, email sebastian@escribanianadela.com.ar / ap@escribanianadela.com.ar a quien las partes facultan para hacer las citaciones y emplazamientos de Acto Notarial. La fecha máxima de escrituración prevista podrá prorrogarse </w:t>
-      </w:r>
-      <w:proofErr w:type="gramStart"/>
-      <w:r>
-        <w:rPr>
-          <w:rFonts w:ascii="Times New Roman" w:hAnsi="Times New Roman" w:cs="Times New Roman"/>
-          <w:color w:val="000000"/>
-          <w:sz w:val="24"/>
-          <w:szCs w:val="24"/>
-          <w:lang w:val="es-ES_tradnl"/>
-        </w:rPr>
-        <w:t>en caso que</w:t>
-      </w:r>
-      <w:proofErr w:type="gramEnd"/>
-      <w:r>
-        <w:rPr>
-          <w:rFonts w:ascii="Times New Roman" w:hAnsi="Times New Roman" w:cs="Times New Roman"/>
-          <w:color w:val="000000"/>
-          <w:sz w:val="24"/>
-          <w:szCs w:val="24"/>
-          <w:lang w:val="es-ES_tradnl"/>
-        </w:rPr>
-        <w:t xml:space="preserve"> el trámite a realizar en el expediente sucesorio sufriera demoras por causas ajenas a la diligencia de la parte vendedora. Las partes asimismo se obligan a hacer entrega de la documentación correspondiente, como ser títulos originales. El pago de tasas, De corresponder, el impuesto a las ganancias, sellados, impuestos y demás erogaciones emergentes de la escritura traslativa de dominio serán soportados en su totalidad por la PARTE COMPRADORA, incluyendo el pago del impuesto de sellos que pudiera corresponder. </w:t>
+        <w:t xml:space="preserve"> 1453, teléfonos 4334-1482, email sebastian@escribanianadela.com.ar / ap@escribanianadela.com.ar a quien las partes facultan para hacer las citaciones y emplazamientos de Acto Notarial. La fecha máxima de escrituración prevista podrá prorrogarse en caso que el trámite a realizar en el expediente sucesorio sufriera demoras por causas ajenas a la diligencia de la parte vendedora. Las partes asimismo se obligan a hacer entrega de la documentación correspondiente, como ser títulos originales. El pago de tasas, De corresponder, el impuesto a las ganancias, sellados, impuestos y demás erogaciones emergentes de la escritura traslativa de dominio serán soportados en su totalidad por la PARTE COMPRADORA, incluyendo el pago del impuesto de sellos que pudiera corresponder. </w:t>
       </w:r>
     </w:p>
     <w:p>
@@ -2103,27 +2025,7 @@
           <w:szCs w:val="24"/>
           <w:lang w:val="es-ES_tradnl"/>
         </w:rPr>
-        <w:t xml:space="preserve"> la suma recibida en este acto, con más otra suma igual en concepto de indemnización, dentro de las 48 horas de producida la mora, sin necesidad de interpelación judicial o extrajudicial, con facultad para iniciar las acciones que correspondan. En este último caso será aplicable lo establecido por el artículo tercero del presente boleto, en lo que se refiere al pago en dólares estadounidenses. Para todos los efectos de este Boleto de compraventa, las partes acuerdan que la mora se producirá de pleno derecho previa intimación fehaciente al cumplimiento por 10 días, mediante carta </w:t>
-      </w:r>
-      <w:proofErr w:type="gramStart"/>
-      <w:r>
-        <w:rPr>
-          <w:rFonts w:ascii="Times New Roman" w:hAnsi="Times New Roman" w:cs="Times New Roman"/>
-          <w:sz w:val="24"/>
-          <w:szCs w:val="24"/>
-          <w:lang w:val="es-ES_tradnl"/>
-        </w:rPr>
-        <w:t>documento.-</w:t>
-      </w:r>
-      <w:proofErr w:type="gramEnd"/>
-      <w:r>
-        <w:rPr>
-          <w:rFonts w:ascii="Times New Roman" w:hAnsi="Times New Roman" w:cs="Times New Roman"/>
-          <w:sz w:val="24"/>
-          <w:szCs w:val="24"/>
-          <w:lang w:val="es-ES_tradnl"/>
-        </w:rPr>
-        <w:t xml:space="preserve">  </w:t>
+        <w:t xml:space="preserve"> la suma recibida en este acto, con más otra suma igual en concepto de indemnización, dentro de las 48 horas de producida la mora, sin necesidad de interpelación judicial o extrajudicial, con facultad para iniciar las acciones que correspondan. En este último caso será aplicable lo establecido por el artículo tercero del presente boleto, en lo que se refiere al pago en dólares estadounidenses. Para todos los efectos de este Boleto de compraventa, las partes acuerdan que la mora se producirá de pleno derecho previa intimación fehaciente al cumplimiento por 10 días, mediante carta documento.-  </w:t>
       </w:r>
     </w:p>
     <w:p>
@@ -2209,47 +2111,7 @@
           <w:szCs w:val="24"/>
           <w:lang w:val="es-ES_tradnl"/>
         </w:rPr>
-        <w:t xml:space="preserve">sus herederos deberán unificar su representación dentro de los treinta (30) días del fallecimiento, ratificando el domicilio constituido o constituyendo uno nuevo, siempre dentro de esta Ciudad Autónoma de Buenos Aires, y dar cumplimiento a todas y cada una de las cláusulas y condiciones establecidas en EL BOLETO. Idéntico procedimiento deberá asumir en caso de incapacidad de las partes. Asimismo, se obligan a hacerlo saber a la otra parte. Si en el plazo estipulado no se unificara la representación o si posteriormente no se cumpliera con algunas de las obligaciones establecidas en el BOLETO, la parte cumplidora podrá exigirle a la parte obrar </w:t>
-      </w:r>
-      <w:proofErr w:type="gramStart"/>
-      <w:r>
-        <w:rPr>
-          <w:rFonts w:ascii="Times New Roman" w:hAnsi="Times New Roman" w:cs="Times New Roman"/>
-          <w:sz w:val="24"/>
-          <w:szCs w:val="24"/>
-          <w:lang w:val="es-ES_tradnl"/>
-        </w:rPr>
-        <w:t>de acuerdo a</w:t>
-      </w:r>
-      <w:proofErr w:type="gramEnd"/>
-      <w:r>
-        <w:rPr>
-          <w:rFonts w:ascii="Times New Roman" w:hAnsi="Times New Roman" w:cs="Times New Roman"/>
-          <w:sz w:val="24"/>
-          <w:szCs w:val="24"/>
-          <w:lang w:val="es-ES_tradnl"/>
-        </w:rPr>
-        <w:t xml:space="preserve"> lo establecido en la cláusula </w:t>
-      </w:r>
-      <w:proofErr w:type="gramStart"/>
-      <w:r>
-        <w:rPr>
-          <w:rFonts w:ascii="Times New Roman" w:hAnsi="Times New Roman" w:cs="Times New Roman"/>
-          <w:sz w:val="24"/>
-          <w:szCs w:val="24"/>
-          <w:lang w:val="es-ES_tradnl"/>
-        </w:rPr>
-        <w:t>séptima.-</w:t>
-      </w:r>
-      <w:proofErr w:type="gramEnd"/>
-      <w:r>
-        <w:rPr>
-          <w:rFonts w:ascii="Times New Roman" w:hAnsi="Times New Roman" w:cs="Times New Roman"/>
-          <w:sz w:val="24"/>
-          <w:szCs w:val="24"/>
-          <w:lang w:val="es-ES_tradnl"/>
-        </w:rPr>
-        <w:t xml:space="preserve"> </w:t>
+        <w:t xml:space="preserve">sus herederos deberán unificar su representación dentro de los treinta (30) días del fallecimiento, ratificando el domicilio constituido o constituyendo uno nuevo, siempre dentro de esta Ciudad Autónoma de Buenos Aires, y dar cumplimiento a todas y cada una de las cláusulas y condiciones establecidas en EL BOLETO. Idéntico procedimiento deberá asumir en caso de incapacidad de las partes. Asimismo, se obligan a hacerlo saber a la otra parte. Si en el plazo estipulado no se unificara la representación o si posteriormente no se cumpliera con algunas de las obligaciones establecidas en el BOLETO, la parte cumplidora podrá exigirle a la parte obrar de acuerdo a lo establecido en la cláusula séptima.- </w:t>
       </w:r>
     </w:p>
     <w:p>
@@ -2351,20 +2213,8 @@
           <w:szCs w:val="24"/>
           <w:lang w:val="es-ES_tradnl"/>
         </w:rPr>
-        <w:t xml:space="preserve"> deberá prestar conformidad expresa con dicha cesión, sin la cual la misma no tendrá validez </w:t>
-      </w:r>
-      <w:proofErr w:type="gramStart"/>
-      <w:r>
-        <w:rPr>
-          <w:rFonts w:ascii="Times New Roman" w:hAnsi="Times New Roman" w:cs="Times New Roman"/>
-          <w:color w:val="000000" w:themeColor="text1"/>
-          <w:sz w:val="24"/>
-          <w:szCs w:val="24"/>
-          <w:lang w:val="es-ES_tradnl"/>
-        </w:rPr>
-        <w:t>alguna.-</w:t>
-      </w:r>
-      <w:proofErr w:type="gramEnd"/>
+        <w:t xml:space="preserve"> deberá prestar conformidad expresa con dicha cesión, sin la cual la misma no tendrá validez alguna.-</w:t>
+      </w:r>
     </w:p>
     <w:p>
       <w:pPr>
@@ -2387,27 +2237,7 @@
           <w:szCs w:val="24"/>
           <w:lang w:val="es-ES_tradnl"/>
         </w:rPr>
-        <w:t xml:space="preserve">Las partes se someten a los Tribunales en lo Civil de la Justicia Ordinaria de la Capital Federal, Ciudad Autónoma de Buenos Aires, renunciando a todo otro fuero o jurisdicción que pudiera corresponder, constituyendo domicilio especial en los indicados al comienzo de la presente, donde serán válidas todas las notificaciones, citaciones y emplazamientos que fueren menester </w:t>
-      </w:r>
-      <w:proofErr w:type="gramStart"/>
-      <w:r>
-        <w:rPr>
-          <w:rFonts w:ascii="Times New Roman" w:hAnsi="Times New Roman" w:cs="Times New Roman"/>
-          <w:sz w:val="24"/>
-          <w:szCs w:val="24"/>
-          <w:lang w:val="es-ES_tradnl"/>
-        </w:rPr>
-        <w:t>realizar.-</w:t>
-      </w:r>
-      <w:proofErr w:type="gramEnd"/>
-      <w:r>
-        <w:rPr>
-          <w:rFonts w:ascii="Times New Roman" w:hAnsi="Times New Roman" w:cs="Times New Roman"/>
-          <w:sz w:val="24"/>
-          <w:szCs w:val="24"/>
-          <w:lang w:val="es-ES_tradnl"/>
-        </w:rPr>
-        <w:t xml:space="preserve"> </w:t>
+        <w:t xml:space="preserve">Las partes se someten a los Tribunales en lo Civil de la Justicia Ordinaria de la Capital Federal, Ciudad Autónoma de Buenos Aires, renunciando a todo otro fuero o jurisdicción que pudiera corresponder, constituyendo domicilio especial en los indicados al comienzo de la presente, donde serán válidas todas las notificaciones, citaciones y emplazamientos que fueren menester realizar.- </w:t>
       </w:r>
     </w:p>
     <w:p>
@@ -2449,27 +2279,7 @@
           <w:szCs w:val="24"/>
           <w:lang w:val="es-ES_tradnl"/>
         </w:rPr>
-        <w:t xml:space="preserve">(2) ejemplares de un mismo tenor; uno para la parte adquirente, uno para la parte vendedora en el lugar y fecha arriba </w:t>
-      </w:r>
-      <w:proofErr w:type="gramStart"/>
-      <w:r>
-        <w:rPr>
-          <w:rFonts w:ascii="Times New Roman" w:hAnsi="Times New Roman" w:cs="Times New Roman"/>
-          <w:sz w:val="24"/>
-          <w:szCs w:val="24"/>
-          <w:lang w:val="es-ES_tradnl"/>
-        </w:rPr>
-        <w:t>indicado.-</w:t>
-      </w:r>
-      <w:proofErr w:type="gramEnd"/>
-      <w:r>
-        <w:rPr>
-          <w:rFonts w:ascii="Times New Roman" w:hAnsi="Times New Roman" w:cs="Times New Roman"/>
-          <w:sz w:val="24"/>
-          <w:szCs w:val="24"/>
-          <w:lang w:val="es-ES_tradnl"/>
-        </w:rPr>
-        <w:t xml:space="preserve"> </w:t>
+        <w:t xml:space="preserve">(2) ejemplares de un mismo tenor; uno para la parte adquirente, uno para la parte vendedora en el lugar y fecha arriba indicado.- </w:t>
       </w:r>
     </w:p>
     <w:p>
@@ -2954,6 +2764,7 @@
   <w:style w:type="character" w:default="1" w:styleId="DefaultParagraphFont">
     <w:name w:val="Default Paragraph Font"/>
     <w:uiPriority w:val="1"/>
+    <w:semiHidden/>
     <w:unhideWhenUsed/>
   </w:style>
   <w:style w:type="table" w:default="1" w:styleId="TableNormal">

</xml_diff>